<commit_message>
update main text with zenodo link
</commit_message>
<xml_diff>
--- a/baltic/drafts/GCB/accepted/v3_MS-warming-size-spectrum-model_clean.docx
+++ b/baltic/drafts/GCB/accepted/v3_MS-warming-size-spectrum-model_clean.docx
@@ -1658,21 +1658,21 @@
         <w:rPr>
           <w:lang w:val="en-GB"/>
         </w:rPr>
-        <w:t xml:space="preserve"> 2012; Woodworth-</w:t>
-      </w:r>
-      <w:proofErr w:type="spellStart"/>
-      <w:r>
-        <w:rPr>
+        <w:t xml:space="preserve"> 2012; Woodworth-Jefcoats </w:t>
+      </w:r>
+      <w:r>
+        <w:rPr>
+          <w:i/>
+          <w:iCs/>
           <w:lang w:val="en-GB"/>
         </w:rPr>
-        <w:t>Jefcoats</w:t>
-      </w:r>
-      <w:proofErr w:type="spellEnd"/>
+        <w:t>et al.</w:t>
+      </w:r>
       <w:r>
         <w:rPr>
           <w:lang w:val="en-GB"/>
         </w:rPr>
-        <w:t xml:space="preserve"> </w:t>
+        <w:t xml:space="preserve"> 2013, 2015; Barange </w:t>
       </w:r>
       <w:r>
         <w:rPr>
@@ -1686,21 +1686,21 @@
         <w:rPr>
           <w:lang w:val="en-GB"/>
         </w:rPr>
-        <w:t xml:space="preserve"> 2013, 2015; </w:t>
-      </w:r>
-      <w:proofErr w:type="spellStart"/>
-      <w:r>
-        <w:rPr>
+        <w:t xml:space="preserve"> 2014; Lotze </w:t>
+      </w:r>
+      <w:r>
+        <w:rPr>
+          <w:i/>
+          <w:iCs/>
           <w:lang w:val="en-GB"/>
         </w:rPr>
-        <w:t>Barange</w:t>
-      </w:r>
-      <w:proofErr w:type="spellEnd"/>
+        <w:t>et al.</w:t>
+      </w:r>
       <w:r>
         <w:rPr>
           <w:lang w:val="en-GB"/>
         </w:rPr>
-        <w:t xml:space="preserve"> </w:t>
+        <w:t xml:space="preserve"> 2019; Heneghan </w:t>
       </w:r>
       <w:r>
         <w:rPr>
@@ -1714,63 +1714,7 @@
         <w:rPr>
           <w:lang w:val="en-GB"/>
         </w:rPr>
-        <w:t xml:space="preserve"> 2014; </w:t>
-      </w:r>
-      <w:proofErr w:type="spellStart"/>
-      <w:r>
-        <w:rPr>
-          <w:lang w:val="en-GB"/>
-        </w:rPr>
-        <w:t>Lotze</w:t>
-      </w:r>
-      <w:proofErr w:type="spellEnd"/>
-      <w:r>
-        <w:rPr>
-          <w:lang w:val="en-GB"/>
-        </w:rPr>
-        <w:t xml:space="preserve"> </w:t>
-      </w:r>
-      <w:r>
-        <w:rPr>
-          <w:i/>
-          <w:iCs/>
-          <w:lang w:val="en-GB"/>
-        </w:rPr>
-        <w:t>et al.</w:t>
-      </w:r>
-      <w:r>
-        <w:rPr>
-          <w:lang w:val="en-GB"/>
-        </w:rPr>
-        <w:t xml:space="preserve"> 2019; Heneghan </w:t>
-      </w:r>
-      <w:r>
-        <w:rPr>
-          <w:i/>
-          <w:iCs/>
-          <w:lang w:val="en-GB"/>
-        </w:rPr>
-        <w:t>et al.</w:t>
-      </w:r>
-      <w:r>
-        <w:rPr>
-          <w:lang w:val="en-GB"/>
-        </w:rPr>
-        <w:t xml:space="preserve"> 2021; </w:t>
-      </w:r>
-      <w:proofErr w:type="spellStart"/>
-      <w:r>
-        <w:rPr>
-          <w:lang w:val="en-GB"/>
-        </w:rPr>
-        <w:t>Tittensor</w:t>
-      </w:r>
-      <w:proofErr w:type="spellEnd"/>
-      <w:r>
-        <w:rPr>
-          <w:lang w:val="en-GB"/>
-        </w:rPr>
-        <w:t xml:space="preserve"> </w:t>
+        <w:t xml:space="preserve"> 2021; Tittensor </w:t>
       </w:r>
       <w:r>
         <w:rPr>
@@ -27791,10 +27735,7 @@
         <w:fldChar w:fldCharType="begin"/>
       </w:r>
       <w:r>
-        <w:instrText xml:space="preserve"> HYPERLINK "https://github.com/maxlindmark/mizer-rewi</w:instrText>
-      </w:r>
-      <w:r>
-        <w:instrText xml:space="preserve">ring/tree/rewire-temp/baltic" </w:instrText>
+        <w:instrText xml:space="preserve"> HYPERLINK "https://github.com/maxlindmark/mizer-rewiring/tree/rewire-temp/baltic" </w:instrText>
       </w:r>
       <w:r>
         <w:fldChar w:fldCharType="separate"/>
@@ -27817,7 +27758,62 @@
         <w:rPr>
           <w:rFonts w:cstheme="minorHAnsi"/>
         </w:rPr>
-        <w:t>) and will be deposited on Zenodo upon publication.</w:t>
+        <w:t xml:space="preserve">) and </w:t>
+      </w:r>
+      <w:r>
+        <w:rPr>
+          <w:rFonts w:cstheme="minorHAnsi"/>
+          <w:lang w:val="en-US"/>
+        </w:rPr>
+        <w:t>have</w:t>
+      </w:r>
+      <w:r>
+        <w:rPr>
+          <w:rFonts w:cstheme="minorHAnsi"/>
+        </w:rPr>
+        <w:t xml:space="preserve"> be</w:t>
+      </w:r>
+      <w:proofErr w:type="spellStart"/>
+      <w:r>
+        <w:rPr>
+          <w:rFonts w:cstheme="minorHAnsi"/>
+          <w:lang w:val="en-US"/>
+        </w:rPr>
+        <w:t>en</w:t>
+      </w:r>
+      <w:proofErr w:type="spellEnd"/>
+      <w:r>
+        <w:rPr>
+          <w:rFonts w:cstheme="minorHAnsi"/>
+        </w:rPr>
+        <w:t xml:space="preserve"> deposited on Zenodo</w:t>
+      </w:r>
+      <w:r>
+        <w:rPr>
+          <w:rFonts w:cstheme="minorHAnsi"/>
+          <w:lang w:val="en-US"/>
+        </w:rPr>
+        <w:t xml:space="preserve"> (</w:t>
+      </w:r>
+      <w:r>
+        <w:rPr>
+          <w:rFonts w:cstheme="minorHAnsi"/>
+          <w:lang w:val="en-US"/>
+        </w:rPr>
+        <w:t>https://doi.org/10.5281/zenodo.6821804</w:t>
+      </w:r>
+      <w:r>
+        <w:rPr>
+          <w:rFonts w:cstheme="minorHAnsi"/>
+          <w:lang w:val="en-US"/>
+        </w:rPr>
+        <w:t>)</w:t>
+      </w:r>
+      <w:r>
+        <w:rPr>
+          <w:rFonts w:cstheme="minorHAnsi"/>
+        </w:rPr>
+        <w:t>.</w:t>
       </w:r>
     </w:p>
     <w:p>
@@ -27886,31 +27882,7 @@
         </w:rPr>
       </w:pPr>
       <w:r>
-        <w:t xml:space="preserve">Andersen, K.H., Berge, T., Gonçalves, R.J., </w:t>
-      </w:r>
-      <w:proofErr w:type="spellStart"/>
-      <w:r>
-        <w:t>Hartvig</w:t>
-      </w:r>
-      <w:proofErr w:type="spellEnd"/>
-      <w:r>
-        <w:t xml:space="preserve">, M., </w:t>
-      </w:r>
-      <w:proofErr w:type="spellStart"/>
-      <w:r>
-        <w:t>Heuschele</w:t>
-      </w:r>
-      <w:proofErr w:type="spellEnd"/>
-      <w:r>
-        <w:t xml:space="preserve">, J., </w:t>
-      </w:r>
-      <w:proofErr w:type="spellStart"/>
-      <w:r>
-        <w:t>Hylander</w:t>
-      </w:r>
-      <w:proofErr w:type="spellEnd"/>
-      <w:r>
-        <w:t xml:space="preserve">, S., </w:t>
+        <w:t xml:space="preserve">Andersen, K.H., Berge, T., Gonçalves, R.J., Hartvig, M., Heuschele, J., Hylander, S., </w:t>
       </w:r>
       <w:r>
         <w:rPr>
@@ -27928,18 +27900,8 @@
           <w:iCs/>
           <w:lang w:val="sv-SE"/>
         </w:rPr>
-        <w:t xml:space="preserve">Ann Rev Mar </w:t>
-      </w:r>
-      <w:proofErr w:type="spellStart"/>
-      <w:r>
-        <w:rPr>
-          <w:i/>
-          <w:iCs/>
-          <w:lang w:val="sv-SE"/>
-        </w:rPr>
-        <w:t>Sci</w:t>
-      </w:r>
-      <w:proofErr w:type="spellEnd"/>
+        <w:t>Ann Rev Mar Sci</w:t>
+      </w:r>
       <w:r>
         <w:rPr>
           <w:lang w:val="sv-SE"/>
@@ -27976,17 +27938,7 @@
         <w:pStyle w:val="Bibliography"/>
       </w:pPr>
       <w:r>
-        <w:t xml:space="preserve">Andersen, </w:t>
-      </w:r>
-      <w:proofErr w:type="spellStart"/>
-      <w:proofErr w:type="gramStart"/>
-      <w:r>
-        <w:t>K.Haste</w:t>
-      </w:r>
-      <w:proofErr w:type="spellEnd"/>
-      <w:proofErr w:type="gramEnd"/>
-      <w:r>
-        <w:t xml:space="preserve">. &amp; Pedersen, M. (2009). Damped trophic cascades driven by fishing in model marine ecosystems. </w:t>
+        <w:t xml:space="preserve">Andersen, K.Haste. &amp; Pedersen, M. (2009). Damped trophic cascades driven by fishing in model marine ecosystems. </w:t>
       </w:r>
       <w:r>
         <w:rPr>
@@ -28021,37 +27973,8 @@
       <w:pPr>
         <w:pStyle w:val="Bibliography"/>
       </w:pPr>
-      <w:proofErr w:type="spellStart"/>
-      <w:r>
-        <w:t>Audzijonyte</w:t>
-      </w:r>
-      <w:proofErr w:type="spellEnd"/>
-      <w:r>
-        <w:t xml:space="preserve">, A., </w:t>
-      </w:r>
-      <w:proofErr w:type="spellStart"/>
-      <w:r>
-        <w:t>Barneche</w:t>
-      </w:r>
-      <w:proofErr w:type="spellEnd"/>
-      <w:r>
-        <w:t xml:space="preserve">, D.R., </w:t>
-      </w:r>
-      <w:proofErr w:type="spellStart"/>
-      <w:r>
-        <w:t>Baudron</w:t>
-      </w:r>
-      <w:proofErr w:type="spellEnd"/>
-      <w:r>
-        <w:t xml:space="preserve">, A.R., </w:t>
-      </w:r>
-      <w:proofErr w:type="spellStart"/>
-      <w:r>
-        <w:t>Belmaker</w:t>
-      </w:r>
-      <w:proofErr w:type="spellEnd"/>
-      <w:r>
-        <w:t xml:space="preserve">, J., Clark, T.D., Marshall, C.T., </w:t>
+      <w:r>
+        <w:t xml:space="preserve">Audzijonyte, A., Barneche, D.R., Baudron, A.R., Belmaker, J., Clark, T.D., Marshall, C.T., </w:t>
       </w:r>
       <w:r>
         <w:rPr>
@@ -28078,22 +28001,9 @@
       <w:pPr>
         <w:pStyle w:val="Bibliography"/>
       </w:pPr>
-      <w:proofErr w:type="spellStart"/>
       <w:r>
         <w:lastRenderedPageBreak/>
-        <w:t>Audzijonyte</w:t>
-      </w:r>
-      <w:proofErr w:type="spellEnd"/>
-      <w:r>
-        <w:t xml:space="preserve">, A., </w:t>
-      </w:r>
-      <w:proofErr w:type="spellStart"/>
-      <w:r>
-        <w:t>Kuparinen</w:t>
-      </w:r>
-      <w:proofErr w:type="spellEnd"/>
-      <w:r>
-        <w:t xml:space="preserve">, A., Gorton, R. &amp; Fulton, E.A. (2013). Ecological consequences of body size decline in harvested fish species: positive feedback loops in trophic interactions amplify human impact. </w:t>
+        <w:t xml:space="preserve">Audzijonyte, A., Kuparinen, A., Gorton, R. &amp; Fulton, E.A. (2013). Ecological consequences of body size decline in harvested fish species: positive feedback loops in trophic interactions amplify human impact. </w:t>
       </w:r>
       <w:r>
         <w:rPr>
@@ -28110,21 +28020,8 @@
       <w:pPr>
         <w:pStyle w:val="Bibliography"/>
       </w:pPr>
-      <w:proofErr w:type="spellStart"/>
-      <w:r>
-        <w:t>Audzijonyte</w:t>
-      </w:r>
-      <w:proofErr w:type="spellEnd"/>
-      <w:r>
-        <w:t xml:space="preserve">, A., Richards, S.A., Stuart-Smith, R.D., </w:t>
-      </w:r>
-      <w:proofErr w:type="spellStart"/>
-      <w:r>
-        <w:t>Pecl</w:t>
-      </w:r>
-      <w:proofErr w:type="spellEnd"/>
-      <w:r>
-        <w:t xml:space="preserve">, G., Edgar, G.J., Barrett, N.S., </w:t>
+      <w:r>
+        <w:t xml:space="preserve">Audzijonyte, A., Richards, S.A., Stuart-Smith, R.D., Pecl, G., Edgar, G.J., Barrett, N.S., </w:t>
       </w:r>
       <w:r>
         <w:rPr>
@@ -28141,33 +28038,8 @@
           <w:i/>
           <w:iCs/>
         </w:rPr>
-        <w:t xml:space="preserve">Nat </w:t>
-      </w:r>
-      <w:proofErr w:type="spellStart"/>
-      <w:r>
-        <w:rPr>
-          <w:i/>
-          <w:iCs/>
-        </w:rPr>
-        <w:t>Ecol</w:t>
-      </w:r>
-      <w:proofErr w:type="spellEnd"/>
-      <w:r>
-        <w:rPr>
-          <w:i/>
-          <w:iCs/>
-        </w:rPr>
-        <w:t xml:space="preserve"> </w:t>
-      </w:r>
-      <w:proofErr w:type="spellStart"/>
-      <w:r>
-        <w:rPr>
-          <w:i/>
-          <w:iCs/>
-        </w:rPr>
-        <w:t>Evol</w:t>
-      </w:r>
-      <w:proofErr w:type="spellEnd"/>
+        <w:t>Nat Ecol Evol</w:t>
+      </w:r>
       <w:r>
         <w:t>, 4, 809–814.</w:t>
       </w:r>
@@ -28176,29 +28048,8 @@
       <w:pPr>
         <w:pStyle w:val="Bibliography"/>
       </w:pPr>
-      <w:proofErr w:type="spellStart"/>
-      <w:r>
-        <w:t>Barange</w:t>
-      </w:r>
-      <w:proofErr w:type="spellEnd"/>
-      <w:r>
-        <w:t xml:space="preserve">, M., Merino, G., Blanchard, J.L., </w:t>
-      </w:r>
-      <w:proofErr w:type="spellStart"/>
-      <w:r>
-        <w:t>Scholtens</w:t>
-      </w:r>
-      <w:proofErr w:type="spellEnd"/>
-      <w:r>
-        <w:t xml:space="preserve">, J., </w:t>
-      </w:r>
-      <w:proofErr w:type="spellStart"/>
-      <w:r>
-        <w:t>Harle</w:t>
-      </w:r>
-      <w:proofErr w:type="spellEnd"/>
-      <w:r>
-        <w:t xml:space="preserve">, J., Allison, E.H., </w:t>
+      <w:r>
+        <w:t xml:space="preserve">Barange, M., Merino, G., Blanchard, J.L., Scholtens, J., Harle, J., Allison, E.H., </w:t>
       </w:r>
       <w:r>
         <w:rPr>
@@ -28215,23 +28066,7 @@
           <w:i/>
           <w:iCs/>
         </w:rPr>
-        <w:t xml:space="preserve">Nature </w:t>
-      </w:r>
-      <w:proofErr w:type="spellStart"/>
-      <w:r>
-        <w:rPr>
-          <w:i/>
-          <w:iCs/>
-        </w:rPr>
-        <w:t>Clim</w:t>
-      </w:r>
-      <w:proofErr w:type="spellEnd"/>
-      <w:r>
-        <w:rPr>
-          <w:i/>
-          <w:iCs/>
-        </w:rPr>
-        <w:t xml:space="preserve"> Change</w:t>
+        <w:t>Nature Clim Change</w:t>
       </w:r>
       <w:r>
         <w:t>, 4, 211–216.</w:t>
@@ -28241,21 +28076,8 @@
       <w:pPr>
         <w:pStyle w:val="Bibliography"/>
       </w:pPr>
-      <w:proofErr w:type="spellStart"/>
-      <w:r>
-        <w:t>Barneche</w:t>
-      </w:r>
-      <w:proofErr w:type="spellEnd"/>
-      <w:r>
-        <w:t xml:space="preserve">, D.R., Jahn, M. &amp; </w:t>
-      </w:r>
-      <w:proofErr w:type="spellStart"/>
-      <w:r>
-        <w:t>Seebacher</w:t>
-      </w:r>
-      <w:proofErr w:type="spellEnd"/>
-      <w:r>
-        <w:t xml:space="preserve">, F. (2019). Warming increases the cost of growth in a model vertebrate. </w:t>
+      <w:r>
+        <w:t xml:space="preserve">Barneche, D.R., Jahn, M. &amp; Seebacher, F. (2019). Warming increases the cost of growth in a model vertebrate. </w:t>
       </w:r>
       <w:r>
         <w:rPr>
@@ -28273,15 +28095,7 @@
         <w:pStyle w:val="Bibliography"/>
       </w:pPr>
       <w:r>
-        <w:t xml:space="preserve">Barnes, C., </w:t>
-      </w:r>
-      <w:proofErr w:type="spellStart"/>
-      <w:r>
-        <w:t>Irigoien</w:t>
-      </w:r>
-      <w:proofErr w:type="spellEnd"/>
-      <w:r>
-        <w:t xml:space="preserve">, X., De Oliveira, J.A.A., Maxwell, D. &amp; Jennings, S. (2011). Predicting marine phytoplankton community size structure from empirical relationships with remotely sensed variables. </w:t>
+        <w:t xml:space="preserve">Barnes, C., Irigoien, X., De Oliveira, J.A.A., Maxwell, D. &amp; Jennings, S. (2011). Predicting marine phytoplankton community size structure from empirical relationships with remotely sensed variables. </w:t>
       </w:r>
       <w:r>
         <w:rPr>
@@ -28298,21 +28112,8 @@
       <w:pPr>
         <w:pStyle w:val="Bibliography"/>
       </w:pPr>
-      <w:proofErr w:type="spellStart"/>
-      <w:r>
-        <w:t>Baudron</w:t>
-      </w:r>
-      <w:proofErr w:type="spellEnd"/>
-      <w:r>
-        <w:t xml:space="preserve">, A.R., Needle, C.L., </w:t>
-      </w:r>
-      <w:proofErr w:type="spellStart"/>
-      <w:r>
-        <w:t>Rijnsdorp</w:t>
-      </w:r>
-      <w:proofErr w:type="spellEnd"/>
-      <w:r>
-        <w:t xml:space="preserve">, A.D. &amp; Marshall, C.T. (2014). Warming temperatures and smaller body sizes: synchronous changes in growth of North Sea fishes. </w:t>
+      <w:r>
+        <w:t xml:space="preserve">Baudron, A.R., Needle, C.L., Rijnsdorp, A.D. &amp; Marshall, C.T. (2014). Warming temperatures and smaller body sizes: synchronous changes in growth of North Sea fishes. </w:t>
       </w:r>
       <w:r>
         <w:rPr>
@@ -28366,15 +28167,7 @@
         <w:pStyle w:val="Bibliography"/>
       </w:pPr>
       <w:r>
-        <w:t xml:space="preserve">Blanchard, J.L., Andersen, K.H., Scott, F., </w:t>
-      </w:r>
-      <w:proofErr w:type="spellStart"/>
-      <w:r>
-        <w:t>Hintzen</w:t>
-      </w:r>
-      <w:proofErr w:type="spellEnd"/>
-      <w:r>
-        <w:t xml:space="preserve">, N.T., Piet, G. &amp; Jennings, S. (2014). Evaluating targets and trade-offs among fisheries and conservation objectives using a multispecies size spectrum model. </w:t>
+        <w:t xml:space="preserve">Blanchard, J.L., Andersen, K.H., Scott, F., Hintzen, N.T., Piet, G. &amp; Jennings, S. (2014). Evaluating targets and trade-offs among fisheries and conservation objectives using a multispecies size spectrum model. </w:t>
       </w:r>
       <w:r>
         <w:rPr>
@@ -28392,15 +28185,7 @@
         <w:pStyle w:val="Bibliography"/>
       </w:pPr>
       <w:r>
-        <w:t xml:space="preserve">Blanchard, J.L., Jennings, S., Holmes, R., </w:t>
-      </w:r>
-      <w:proofErr w:type="spellStart"/>
-      <w:r>
-        <w:t>Harle</w:t>
-      </w:r>
-      <w:proofErr w:type="spellEnd"/>
-      <w:r>
-        <w:t xml:space="preserve">, J., Merino, G., Allen, J.I., </w:t>
+        <w:t xml:space="preserve">Blanchard, J.L., Jennings, S., Holmes, R., Harle, J., Merino, G., Allen, J.I., </w:t>
       </w:r>
       <w:r>
         <w:rPr>
@@ -28428,15 +28213,7 @@
         <w:pStyle w:val="Bibliography"/>
       </w:pPr>
       <w:r>
-        <w:t xml:space="preserve">Brown, J.H., </w:t>
-      </w:r>
-      <w:proofErr w:type="spellStart"/>
-      <w:r>
-        <w:t>Gillooly</w:t>
-      </w:r>
-      <w:proofErr w:type="spellEnd"/>
-      <w:r>
-        <w:t xml:space="preserve">, J.F., Allen, A.P., Savage, V.M. &amp; West, G.B. (2004). Toward a metabolic theory of ecology. </w:t>
+        <w:t xml:space="preserve">Brown, J.H., Gillooly, J.F., Allen, A.P., Savage, V.M. &amp; West, G.B. (2004). Toward a metabolic theory of ecology. </w:t>
       </w:r>
       <w:r>
         <w:rPr>
@@ -28454,54 +28231,14 @@
         <w:pStyle w:val="Bibliography"/>
       </w:pPr>
       <w:r>
-        <w:t xml:space="preserve">Byrd, R.H., Lu, </w:t>
-      </w:r>
-      <w:proofErr w:type="spellStart"/>
-      <w:r>
-        <w:t>Peihuang</w:t>
-      </w:r>
-      <w:proofErr w:type="spellEnd"/>
-      <w:r>
-        <w:t xml:space="preserve">., </w:t>
-      </w:r>
-      <w:proofErr w:type="spellStart"/>
-      <w:r>
-        <w:t>Nocedal</w:t>
-      </w:r>
-      <w:proofErr w:type="spellEnd"/>
-      <w:r>
-        <w:t xml:space="preserve">, Jorge. &amp; Zhu, </w:t>
-      </w:r>
-      <w:proofErr w:type="spellStart"/>
-      <w:r>
-        <w:t>Ciyou</w:t>
-      </w:r>
-      <w:proofErr w:type="spellEnd"/>
-      <w:r>
-        <w:t xml:space="preserve">. (1995). A Limited Memory Algorithm for Bound Constrained Optimization. </w:t>
-      </w:r>
-      <w:r>
-        <w:rPr>
-          <w:i/>
-          <w:iCs/>
-        </w:rPr>
-        <w:t xml:space="preserve">SIAM J. Sci. </w:t>
-      </w:r>
-      <w:proofErr w:type="spellStart"/>
-      <w:r>
-        <w:rPr>
-          <w:i/>
-          <w:iCs/>
-        </w:rPr>
-        <w:t>Comput</w:t>
-      </w:r>
-      <w:proofErr w:type="spellEnd"/>
-      <w:r>
-        <w:rPr>
-          <w:i/>
-          <w:iCs/>
-        </w:rPr>
-        <w:t>.</w:t>
+        <w:t xml:space="preserve">Byrd, R.H., Lu, Peihuang., Nocedal, Jorge. &amp; Zhu, Ciyou. (1995). A Limited Memory Algorithm for Bound Constrained Optimization. </w:t>
+      </w:r>
+      <w:r>
+        <w:rPr>
+          <w:i/>
+          <w:iCs/>
+        </w:rPr>
+        <w:t>SIAM J. Sci. Comput.</w:t>
       </w:r>
       <w:r>
         <w:t>, 16, 1190–1208.</w:t>
@@ -28529,45 +28266,8 @@
       <w:pPr>
         <w:pStyle w:val="Bibliography"/>
       </w:pPr>
-      <w:proofErr w:type="spellStart"/>
-      <w:r>
-        <w:t>Casini</w:t>
-      </w:r>
-      <w:proofErr w:type="spellEnd"/>
-      <w:r>
-        <w:t xml:space="preserve">, M., </w:t>
-      </w:r>
-      <w:proofErr w:type="spellStart"/>
-      <w:r>
-        <w:t>Hjelm</w:t>
-      </w:r>
-      <w:proofErr w:type="spellEnd"/>
-      <w:r>
-        <w:t xml:space="preserve">, J., </w:t>
-      </w:r>
-      <w:proofErr w:type="spellStart"/>
-      <w:r>
-        <w:t>Molinero</w:t>
-      </w:r>
-      <w:proofErr w:type="spellEnd"/>
-      <w:r>
-        <w:t xml:space="preserve">, J.-C., </w:t>
-      </w:r>
-      <w:proofErr w:type="spellStart"/>
-      <w:r>
-        <w:t>Lövgren</w:t>
-      </w:r>
-      <w:proofErr w:type="spellEnd"/>
-      <w:r>
-        <w:t xml:space="preserve">, J., Cardinale, M., </w:t>
-      </w:r>
-      <w:proofErr w:type="spellStart"/>
-      <w:r>
-        <w:t>Bartolino</w:t>
-      </w:r>
-      <w:proofErr w:type="spellEnd"/>
-      <w:r>
-        <w:t xml:space="preserve">, V., </w:t>
+      <w:r>
+        <w:t xml:space="preserve">Casini, M., Hjelm, J., Molinero, J.-C., Lövgren, J., Cardinale, M., Bartolino, V., </w:t>
       </w:r>
       <w:r>
         <w:rPr>
@@ -28594,29 +28294,8 @@
       <w:pPr>
         <w:pStyle w:val="Bibliography"/>
       </w:pPr>
-      <w:proofErr w:type="spellStart"/>
-      <w:r>
-        <w:t>Casini</w:t>
-      </w:r>
-      <w:proofErr w:type="spellEnd"/>
-      <w:r>
-        <w:t xml:space="preserve">, M., </w:t>
-      </w:r>
-      <w:proofErr w:type="spellStart"/>
-      <w:r>
-        <w:t>Käll</w:t>
-      </w:r>
-      <w:proofErr w:type="spellEnd"/>
-      <w:r>
-        <w:t xml:space="preserve">, F., Hansson, M., </w:t>
-      </w:r>
-      <w:proofErr w:type="spellStart"/>
-      <w:r>
-        <w:t>Plikshs</w:t>
-      </w:r>
-      <w:proofErr w:type="spellEnd"/>
-      <w:r>
-        <w:t xml:space="preserve">, M., Baranova, T., Karlsson, O., </w:t>
+      <w:r>
+        <w:t xml:space="preserve">Casini, M., Käll, F., Hansson, M., Plikshs, M., Baranova, T., Karlsson, O., </w:t>
       </w:r>
       <w:r>
         <w:rPr>
@@ -28661,21 +28340,8 @@
       <w:pPr>
         <w:pStyle w:val="Bibliography"/>
       </w:pPr>
-      <w:proofErr w:type="spellStart"/>
-      <w:r>
-        <w:t>Daufresne</w:t>
-      </w:r>
-      <w:proofErr w:type="spellEnd"/>
-      <w:r>
-        <w:t xml:space="preserve">, M., </w:t>
-      </w:r>
-      <w:proofErr w:type="spellStart"/>
-      <w:r>
-        <w:t>Lengfellner</w:t>
-      </w:r>
-      <w:proofErr w:type="spellEnd"/>
-      <w:r>
-        <w:t xml:space="preserve">, K. &amp; Sommer, U. (2009). Global warming benefits the small in aquatic ecosystems. </w:t>
+      <w:r>
+        <w:t xml:space="preserve">Daufresne, M., Lengfellner, K. &amp; Sommer, U. (2009). Global warming benefits the small in aquatic ecosystems. </w:t>
       </w:r>
       <w:r>
         <w:rPr>
@@ -28715,31 +28381,7 @@
         </w:rPr>
       </w:pPr>
       <w:r>
-        <w:t xml:space="preserve">Dieterich, C., Wang, S., </w:t>
-      </w:r>
-      <w:proofErr w:type="spellStart"/>
-      <w:r>
-        <w:t>Schimanke</w:t>
-      </w:r>
-      <w:proofErr w:type="spellEnd"/>
-      <w:r>
-        <w:t xml:space="preserve">, S., </w:t>
-      </w:r>
-      <w:proofErr w:type="spellStart"/>
-      <w:r>
-        <w:t>Gröger</w:t>
-      </w:r>
-      <w:proofErr w:type="spellEnd"/>
-      <w:r>
-        <w:t xml:space="preserve">, M., Klein, B., </w:t>
-      </w:r>
-      <w:proofErr w:type="spellStart"/>
-      <w:r>
-        <w:t>Hordoir</w:t>
-      </w:r>
-      <w:proofErr w:type="spellEnd"/>
-      <w:r>
-        <w:t xml:space="preserve">, R., </w:t>
+        <w:t xml:space="preserve">Dieterich, C., Wang, S., Schimanke, S., Gröger, M., Klein, B., Hordoir, R., </w:t>
       </w:r>
       <w:r>
         <w:rPr>
@@ -28751,7 +28393,6 @@
       <w:r>
         <w:t xml:space="preserve"> (2019). Surface Heat Budget over the North Sea in Climate Change Simulations. </w:t>
       </w:r>
-      <w:proofErr w:type="spellStart"/>
       <w:r>
         <w:rPr>
           <w:i/>
@@ -28760,7 +28401,6 @@
         </w:rPr>
         <w:t>Atmosphere</w:t>
       </w:r>
-      <w:proofErr w:type="spellEnd"/>
       <w:r>
         <w:rPr>
           <w:lang w:val="sv-SE"/>
@@ -28776,49 +28416,7 @@
         <w:rPr>
           <w:lang w:val="sv-SE"/>
         </w:rPr>
-        <w:t xml:space="preserve">van </w:t>
-      </w:r>
-      <w:proofErr w:type="spellStart"/>
-      <w:r>
-        <w:rPr>
-          <w:lang w:val="sv-SE"/>
-        </w:rPr>
-        <w:t>Dorst</w:t>
-      </w:r>
-      <w:proofErr w:type="spellEnd"/>
-      <w:r>
-        <w:rPr>
-          <w:lang w:val="sv-SE"/>
-        </w:rPr>
-        <w:t xml:space="preserve">, R.M., Gårdmark, A., Svanbäck, R., </w:t>
-      </w:r>
-      <w:proofErr w:type="spellStart"/>
-      <w:r>
-        <w:rPr>
-          <w:lang w:val="sv-SE"/>
-        </w:rPr>
-        <w:t>Beier</w:t>
-      </w:r>
-      <w:proofErr w:type="spellEnd"/>
-      <w:r>
-        <w:rPr>
-          <w:lang w:val="sv-SE"/>
-        </w:rPr>
-        <w:t xml:space="preserve">, U., </w:t>
-      </w:r>
-      <w:proofErr w:type="spellStart"/>
-      <w:r>
-        <w:rPr>
-          <w:lang w:val="sv-SE"/>
-        </w:rPr>
-        <w:t>Weyhenmeyer</w:t>
-      </w:r>
-      <w:proofErr w:type="spellEnd"/>
-      <w:r>
-        <w:rPr>
-          <w:lang w:val="sv-SE"/>
-        </w:rPr>
-        <w:t xml:space="preserve">, G.A. &amp; Huss, M. (2019). </w:t>
+        <w:t xml:space="preserve">van Dorst, R.M., Gårdmark, A., Svanbäck, R., Beier, U., Weyhenmeyer, G.A. &amp; Huss, M. (2019). </w:t>
       </w:r>
       <w:r>
         <w:t xml:space="preserve">Warmer and browner waters decrease fish biomass production. </w:t>
@@ -28839,15 +28437,7 @@
         <w:pStyle w:val="Bibliography"/>
       </w:pPr>
       <w:r>
-        <w:t xml:space="preserve">Englund, G., </w:t>
-      </w:r>
-      <w:proofErr w:type="spellStart"/>
-      <w:r>
-        <w:t>Öhlund</w:t>
-      </w:r>
-      <w:proofErr w:type="spellEnd"/>
-      <w:r>
-        <w:t xml:space="preserve">, G., Hein, C.L. &amp; Diehl, S. (2011). Temperature dependence of the functional response. </w:t>
+        <w:t xml:space="preserve">Englund, G., Öhlund, G., Hein, C.L. &amp; Diehl, S. (2011). Temperature dependence of the functional response. </w:t>
       </w:r>
       <w:r>
         <w:rPr>
@@ -28883,23 +28473,7 @@
         <w:pStyle w:val="Bibliography"/>
       </w:pPr>
       <w:r>
-        <w:t xml:space="preserve">Free, C.M., Thorson, J.T., Pinsky, M.L., </w:t>
-      </w:r>
-      <w:proofErr w:type="spellStart"/>
-      <w:r>
-        <w:t>Oken</w:t>
-      </w:r>
-      <w:proofErr w:type="spellEnd"/>
-      <w:r>
-        <w:t xml:space="preserve">, K.L., </w:t>
-      </w:r>
-      <w:proofErr w:type="spellStart"/>
-      <w:r>
-        <w:t>Wiedenmann</w:t>
-      </w:r>
-      <w:proofErr w:type="spellEnd"/>
-      <w:r>
-        <w:t xml:space="preserve">, J. &amp; Jensen, O.P. (2019). Impacts of historical warming on marine fisheries production. </w:t>
+        <w:t xml:space="preserve">Free, C.M., Thorson, J.T., Pinsky, M.L., Oken, K.L., Wiedenmann, J. &amp; Jensen, O.P. (2019). Impacts of historical warming on marine fisheries production. </w:t>
       </w:r>
       <w:r>
         <w:rPr>
@@ -28920,15 +28494,7 @@
         </w:rPr>
       </w:pPr>
       <w:r>
-        <w:t xml:space="preserve">Galbraith, E.D., </w:t>
-      </w:r>
-      <w:proofErr w:type="spellStart"/>
-      <w:r>
-        <w:t>Carozza</w:t>
-      </w:r>
-      <w:proofErr w:type="spellEnd"/>
-      <w:r>
-        <w:t xml:space="preserve">, D.A. &amp; Bianchi, D. (2017). A coupled human-Earth model perspective on long-term trends in the global marine fishery. </w:t>
+        <w:t xml:space="preserve">Galbraith, E.D., Carozza, D.A. &amp; Bianchi, D. (2017). A coupled human-Earth model perspective on long-term trends in the global marine fishery. </w:t>
       </w:r>
       <w:r>
         <w:rPr>
@@ -28936,37 +28502,13 @@
           <w:iCs/>
           <w:lang w:val="sv-SE"/>
         </w:rPr>
-        <w:t xml:space="preserve">Nat </w:t>
-      </w:r>
-      <w:proofErr w:type="spellStart"/>
-      <w:r>
-        <w:rPr>
-          <w:i/>
-          <w:iCs/>
+        <w:t>Nat Commun</w:t>
+      </w:r>
+      <w:r>
+        <w:rPr>
           <w:lang w:val="sv-SE"/>
         </w:rPr>
-        <w:t>Commun</w:t>
-      </w:r>
-      <w:proofErr w:type="spellEnd"/>
-      <w:r>
-        <w:rPr>
-          <w:lang w:val="sv-SE"/>
-        </w:rPr>
-        <w:t xml:space="preserve">, 8, </w:t>
-      </w:r>
-      <w:proofErr w:type="gramStart"/>
-      <w:r>
-        <w:rPr>
-          <w:lang w:val="sv-SE"/>
-        </w:rPr>
-        <w:t>14884</w:t>
-      </w:r>
-      <w:proofErr w:type="gramEnd"/>
-      <w:r>
-        <w:rPr>
-          <w:lang w:val="sv-SE"/>
-        </w:rPr>
-        <w:t>.</w:t>
+        <w:t>, 8, 14884.</w:t>
       </w:r>
     </w:p>
     <w:p>
@@ -28977,35 +28519,7 @@
         <w:rPr>
           <w:lang w:val="sv-SE"/>
         </w:rPr>
-        <w:t xml:space="preserve">Gårdmark, A., </w:t>
-      </w:r>
-      <w:proofErr w:type="spellStart"/>
-      <w:r>
-        <w:rPr>
-          <w:lang w:val="sv-SE"/>
-        </w:rPr>
-        <w:t>Casini</w:t>
-      </w:r>
-      <w:proofErr w:type="spellEnd"/>
-      <w:r>
-        <w:rPr>
-          <w:lang w:val="sv-SE"/>
-        </w:rPr>
-        <w:t xml:space="preserve">, M., Huss, M., van </w:t>
-      </w:r>
-      <w:proofErr w:type="spellStart"/>
-      <w:r>
-        <w:rPr>
-          <w:lang w:val="sv-SE"/>
-        </w:rPr>
-        <w:t>Leeuwen</w:t>
-      </w:r>
-      <w:proofErr w:type="spellEnd"/>
-      <w:r>
-        <w:rPr>
-          <w:lang w:val="sv-SE"/>
-        </w:rPr>
-        <w:t xml:space="preserve">, A., Hjelm, J., Persson, L., </w:t>
+        <w:t xml:space="preserve">Gårdmark, A., Casini, M., Huss, M., van Leeuwen, A., Hjelm, J., Persson, L., </w:t>
       </w:r>
       <w:r>
         <w:rPr>
@@ -29039,13 +28553,8 @@
       <w:pPr>
         <w:pStyle w:val="Bibliography"/>
       </w:pPr>
-      <w:proofErr w:type="spellStart"/>
-      <w:r>
-        <w:t>Gårdmark</w:t>
-      </w:r>
-      <w:proofErr w:type="spellEnd"/>
-      <w:r>
-        <w:t xml:space="preserve">, A. &amp; Huss, M. (2020). Individual variation and interactions explain food web responses to global warming. </w:t>
+      <w:r>
+        <w:t xml:space="preserve">Gårdmark, A. &amp; Huss, M. (2020). Individual variation and interactions explain food web responses to global warming. </w:t>
       </w:r>
       <w:r>
         <w:rPr>
@@ -29063,15 +28572,7 @@
         <w:pStyle w:val="Bibliography"/>
       </w:pPr>
       <w:r>
-        <w:t xml:space="preserve">Gilbert, B., Tunney, T.D., McCann, K.S., DeLong, J.P., </w:t>
-      </w:r>
-      <w:proofErr w:type="spellStart"/>
-      <w:r>
-        <w:t>Vasseur</w:t>
-      </w:r>
-      <w:proofErr w:type="spellEnd"/>
-      <w:r>
-        <w:t xml:space="preserve">, D.A., Savage, V.M., </w:t>
+        <w:t xml:space="preserve">Gilbert, B., Tunney, T.D., McCann, K.S., DeLong, J.P., Vasseur, D.A., Savage, V.M., </w:t>
       </w:r>
       <w:r>
         <w:rPr>
@@ -29098,21 +28599,8 @@
       <w:pPr>
         <w:pStyle w:val="Bibliography"/>
       </w:pPr>
-      <w:proofErr w:type="spellStart"/>
-      <w:r>
-        <w:t>Gillooly</w:t>
-      </w:r>
-      <w:proofErr w:type="spellEnd"/>
-      <w:r>
-        <w:t xml:space="preserve">, J.F., Brown, J.H., West, G.B., Savage, V.M. &amp; </w:t>
-      </w:r>
-      <w:proofErr w:type="spellStart"/>
-      <w:r>
-        <w:t>Charnov</w:t>
-      </w:r>
-      <w:proofErr w:type="spellEnd"/>
-      <w:r>
-        <w:t xml:space="preserve">, E.L. (2001). Effects of size and temperature on metabolic rate. </w:t>
+      <w:r>
+        <w:t xml:space="preserve">Gillooly, J.F., Brown, J.H., West, G.B., Savage, V.M. &amp; Charnov, E.L. (2001). Effects of size and temperature on metabolic rate. </w:t>
       </w:r>
       <w:r>
         <w:rPr>
@@ -29129,55 +28617,16 @@
       <w:pPr>
         <w:pStyle w:val="Bibliography"/>
       </w:pPr>
-      <w:proofErr w:type="spellStart"/>
-      <w:r>
-        <w:t>Gröger</w:t>
-      </w:r>
-      <w:proofErr w:type="spellEnd"/>
-      <w:r>
-        <w:t xml:space="preserve">, M., </w:t>
-      </w:r>
-      <w:proofErr w:type="spellStart"/>
-      <w:r>
-        <w:t>Arneborg</w:t>
-      </w:r>
-      <w:proofErr w:type="spellEnd"/>
-      <w:r>
-        <w:t xml:space="preserve">, L., Dieterich, C., </w:t>
-      </w:r>
-      <w:proofErr w:type="spellStart"/>
-      <w:r>
-        <w:t>Höglund</w:t>
-      </w:r>
-      <w:proofErr w:type="spellEnd"/>
-      <w:r>
-        <w:t xml:space="preserve">, A. &amp; Meier, H.E.M. (2019). Summer hydrographic changes in the Baltic Sea, Kattegat and Skagerrak projected in an ensemble of climate scenarios downscaled with a coupled regional ocean–sea ice–atmosphere model. </w:t>
-      </w:r>
-      <w:proofErr w:type="spellStart"/>
-      <w:r>
-        <w:rPr>
-          <w:i/>
-          <w:iCs/>
-        </w:rPr>
-        <w:t>Clim</w:t>
-      </w:r>
-      <w:proofErr w:type="spellEnd"/>
-      <w:r>
-        <w:rPr>
-          <w:i/>
-          <w:iCs/>
-        </w:rPr>
-        <w:t xml:space="preserve"> </w:t>
-      </w:r>
-      <w:proofErr w:type="spellStart"/>
-      <w:r>
-        <w:rPr>
-          <w:i/>
-          <w:iCs/>
-        </w:rPr>
-        <w:t>Dyn</w:t>
-      </w:r>
-      <w:proofErr w:type="spellEnd"/>
+      <w:r>
+        <w:t xml:space="preserve">Gröger, M., Arneborg, L., Dieterich, C., Höglund, A. &amp; Meier, H.E.M. (2019). Summer hydrographic changes in the Baltic Sea, Kattegat and Skagerrak projected in an ensemble of climate scenarios downscaled with a coupled regional ocean–sea ice–atmosphere model. </w:t>
+      </w:r>
+      <w:r>
+        <w:rPr>
+          <w:i/>
+          <w:iCs/>
+        </w:rPr>
+        <w:t>Clim Dyn</w:t>
+      </w:r>
       <w:r>
         <w:t>, 53, 5945–5966.</w:t>
       </w:r>
@@ -29186,29 +28635,8 @@
       <w:pPr>
         <w:pStyle w:val="Bibliography"/>
       </w:pPr>
-      <w:proofErr w:type="spellStart"/>
-      <w:r>
-        <w:t>Guiet</w:t>
-      </w:r>
-      <w:proofErr w:type="spellEnd"/>
-      <w:r>
-        <w:t xml:space="preserve">, J., </w:t>
-      </w:r>
-      <w:proofErr w:type="spellStart"/>
-      <w:r>
-        <w:t>Aumont</w:t>
-      </w:r>
-      <w:proofErr w:type="spellEnd"/>
-      <w:r>
-        <w:t xml:space="preserve">, O., </w:t>
-      </w:r>
-      <w:proofErr w:type="spellStart"/>
-      <w:r>
-        <w:t>Poggiale</w:t>
-      </w:r>
-      <w:proofErr w:type="spellEnd"/>
-      <w:r>
-        <w:t xml:space="preserve">, J.-C. &amp; Maury, O. (2016). Effects of lower trophic level biomass and water temperature on fish communities: A modelling study. </w:t>
+      <w:r>
+        <w:t xml:space="preserve">Guiet, J., Aumont, O., Poggiale, J.-C. &amp; Maury, O. (2016). Effects of lower trophic level biomass and water temperature on fish communities: A modelling study. </w:t>
       </w:r>
       <w:r>
         <w:rPr>
@@ -29225,21 +28653,8 @@
       <w:pPr>
         <w:pStyle w:val="Bibliography"/>
       </w:pPr>
-      <w:proofErr w:type="spellStart"/>
-      <w:r>
-        <w:t>Handeland</w:t>
-      </w:r>
-      <w:proofErr w:type="spellEnd"/>
-      <w:r>
-        <w:t xml:space="preserve">, S.O., </w:t>
-      </w:r>
-      <w:proofErr w:type="spellStart"/>
-      <w:r>
-        <w:t>Imsland</w:t>
-      </w:r>
-      <w:proofErr w:type="spellEnd"/>
-      <w:r>
-        <w:t xml:space="preserve">, A.K. &amp; Stefansson, S.O. (2008). The effect of temperature and fish size on growth, feed intake, food conversion efficiency and stomach evacuation rate of Atlantic salmon post-smolts. </w:t>
+      <w:r>
+        <w:t xml:space="preserve">Handeland, S.O., Imsland, A.K. &amp; Stefansson, S.O. (2008). The effect of temperature and fish size on growth, feed intake, food conversion efficiency and stomach evacuation rate of Atlantic salmon post-smolts. </w:t>
       </w:r>
       <w:r>
         <w:rPr>
@@ -29256,13 +28671,8 @@
       <w:pPr>
         <w:pStyle w:val="Bibliography"/>
       </w:pPr>
-      <w:proofErr w:type="spellStart"/>
-      <w:r>
-        <w:t>Hartvig</w:t>
-      </w:r>
-      <w:proofErr w:type="spellEnd"/>
-      <w:r>
-        <w:t xml:space="preserve">, M., Andersen, K.H. &amp; Beyer, J.E. (2011). Food web framework for size-structured populations. </w:t>
+      <w:r>
+        <w:t xml:space="preserve">Hartvig, M., Andersen, K.H. &amp; Beyer, J.E. (2011). Food web framework for size-structured populations. </w:t>
       </w:r>
       <w:r>
         <w:rPr>
@@ -29328,36 +28738,15 @@
           <w:lang w:val="sv-SE"/>
         </w:rPr>
       </w:pPr>
-      <w:proofErr w:type="spellStart"/>
-      <w:r>
-        <w:t>Hilborn</w:t>
-      </w:r>
-      <w:proofErr w:type="spellEnd"/>
-      <w:r>
-        <w:t xml:space="preserve">, R. &amp; Walters, C.J. (1992). </w:t>
-      </w:r>
-      <w:r>
-        <w:rPr>
-          <w:i/>
-          <w:iCs/>
-        </w:rPr>
-        <w:t xml:space="preserve">Quantitative Fisheries Stock Assessment: Choice, </w:t>
-      </w:r>
-      <w:proofErr w:type="gramStart"/>
-      <w:r>
-        <w:rPr>
-          <w:i/>
-          <w:iCs/>
-        </w:rPr>
-        <w:t>Dynamics</w:t>
-      </w:r>
-      <w:proofErr w:type="gramEnd"/>
-      <w:r>
-        <w:rPr>
-          <w:i/>
-          <w:iCs/>
-        </w:rPr>
-        <w:t xml:space="preserve"> and Uncertainty</w:t>
+      <w:r>
+        <w:t xml:space="preserve">Hilborn, R. &amp; Walters, C.J. (1992). </w:t>
+      </w:r>
+      <w:r>
+        <w:rPr>
+          <w:i/>
+          <w:iCs/>
+        </w:rPr>
+        <w:t>Quantitative Fisheries Stock Assessment: Choice, Dynamics and Uncertainty</w:t>
       </w:r>
       <w:r>
         <w:t xml:space="preserve">. </w:t>
@@ -29366,21 +28755,7 @@
         <w:rPr>
           <w:lang w:val="sv-SE"/>
         </w:rPr>
-        <w:t xml:space="preserve">Springer, </w:t>
-      </w:r>
-      <w:proofErr w:type="spellStart"/>
-      <w:r>
-        <w:rPr>
-          <w:lang w:val="sv-SE"/>
-        </w:rPr>
-        <w:t>Norwell</w:t>
-      </w:r>
-      <w:proofErr w:type="spellEnd"/>
-      <w:r>
-        <w:rPr>
-          <w:lang w:val="sv-SE"/>
-        </w:rPr>
-        <w:t xml:space="preserve"> MA, USA.</w:t>
+        <w:t>Springer, Norwell MA, USA.</w:t>
       </w:r>
     </w:p>
     <w:p>
@@ -29392,21 +28767,7 @@
           <w:lang w:val="sv-SE"/>
         </w:rPr>
         <w:lastRenderedPageBreak/>
-        <w:t xml:space="preserve">Huss, M., Lindmark, M., Jacobson, P., van </w:t>
-      </w:r>
-      <w:proofErr w:type="spellStart"/>
-      <w:r>
-        <w:rPr>
-          <w:lang w:val="sv-SE"/>
-        </w:rPr>
-        <w:t>Dorst</w:t>
-      </w:r>
-      <w:proofErr w:type="spellEnd"/>
-      <w:r>
-        <w:rPr>
-          <w:lang w:val="sv-SE"/>
-        </w:rPr>
-        <w:t xml:space="preserve">, R.M. &amp; Gårdmark, A. (2019). </w:t>
+        <w:t xml:space="preserve">Huss, M., Lindmark, M., Jacobson, P., van Dorst, R.M. &amp; Gårdmark, A. (2019). </w:t>
       </w:r>
       <w:r>
         <w:t xml:space="preserve">Experimental evidence of gradual size‐dependent shifts in body size and growth of fish in response to warming. </w:t>
@@ -29416,17 +28777,8 @@
           <w:i/>
           <w:iCs/>
         </w:rPr>
-        <w:t xml:space="preserve">Glob Change </w:t>
-      </w:r>
-      <w:proofErr w:type="spellStart"/>
-      <w:r>
-        <w:rPr>
-          <w:i/>
-          <w:iCs/>
-        </w:rPr>
-        <w:t>Biol</w:t>
-      </w:r>
-      <w:proofErr w:type="spellEnd"/>
+        <w:t>Glob Change Biol</w:t>
+      </w:r>
       <w:r>
         <w:t>, 25, 2285–2295.</w:t>
       </w:r>
@@ -29446,15 +28798,7 @@
         <w:t>Report of the Baltic Fisheries Assessment Working Group (WGBFAS)</w:t>
       </w:r>
       <w:r>
-        <w:t xml:space="preserve"> </w:t>
-      </w:r>
-      <w:proofErr w:type="gramStart"/>
-      <w:r>
-        <w:t>( No.</w:t>
-      </w:r>
-      <w:proofErr w:type="gramEnd"/>
-      <w:r>
-        <w:t xml:space="preserve"> ICES CM 2013/ACOM:10.). 10-17 April 2013 ICES Headquarters, Copenhagen.</w:t>
+        <w:t xml:space="preserve"> ( No. ICES CM 2013/ACOM:10.). 10-17 April 2013 ICES Headquarters, Copenhagen.</w:t>
       </w:r>
     </w:p>
     <w:p>
@@ -29472,15 +28816,7 @@
         <w:t>Report of the Baltic Fisheries Assessment Working Group (WGBFAS)</w:t>
       </w:r>
       <w:r>
-        <w:t xml:space="preserve"> </w:t>
-      </w:r>
-      <w:proofErr w:type="gramStart"/>
-      <w:r>
-        <w:t>( No.</w:t>
-      </w:r>
-      <w:proofErr w:type="gramEnd"/>
-      <w:r>
-        <w:t xml:space="preserve"> ICES CM 2015/ACOM:10). 14-21 April 2015 ICES Headquarters, Copenhagen.</w:t>
+        <w:t xml:space="preserve"> ( No. ICES CM 2015/ACOM:10). 14-21 April 2015 ICES Headquarters, Copenhagen.</w:t>
       </w:r>
     </w:p>
     <w:p>
@@ -29498,48 +28834,18 @@
         <w:t>Report of the Baltic Fisheries Assessment Working Group (WGBFAS)</w:t>
       </w:r>
       <w:r>
-        <w:t xml:space="preserve"> </w:t>
-      </w:r>
-      <w:proofErr w:type="gramStart"/>
-      <w:r>
-        <w:t>( No.</w:t>
-      </w:r>
-      <w:proofErr w:type="gramEnd"/>
-      <w:r>
-        <w:t xml:space="preserve"> 3:53).</w:t>
+        <w:t xml:space="preserve"> ( No. 3:53).</w:t>
       </w:r>
     </w:p>
     <w:p>
       <w:pPr>
         <w:pStyle w:val="Bibliography"/>
       </w:pPr>
-      <w:proofErr w:type="spellStart"/>
       <w:r>
         <w:rPr>
           <w:lang w:val="sv-SE"/>
         </w:rPr>
-        <w:t>Ikpewe</w:t>
-      </w:r>
-      <w:proofErr w:type="spellEnd"/>
-      <w:r>
-        <w:rPr>
-          <w:lang w:val="sv-SE"/>
-        </w:rPr>
-        <w:t xml:space="preserve">, I.E., </w:t>
-      </w:r>
-      <w:proofErr w:type="spellStart"/>
-      <w:r>
-        <w:rPr>
-          <w:lang w:val="sv-SE"/>
-        </w:rPr>
-        <w:t>Baudron</w:t>
-      </w:r>
-      <w:proofErr w:type="spellEnd"/>
-      <w:r>
-        <w:rPr>
-          <w:lang w:val="sv-SE"/>
-        </w:rPr>
-        <w:t xml:space="preserve">, A.R., Ponchon, A. &amp; Fernandes, P.G. (2020). </w:t>
+        <w:t xml:space="preserve">Ikpewe, I.E., Baudron, A.R., Ponchon, A. &amp; Fernandes, P.G. (2020). </w:t>
       </w:r>
       <w:r>
         <w:t xml:space="preserve">Bigger juveniles and smaller adults: Changes in fish size correlate with warming seas. </w:t>
@@ -29581,15 +28887,7 @@
         </w:rPr>
       </w:pPr>
       <w:r>
-        <w:t xml:space="preserve">Jennings, S. &amp; </w:t>
-      </w:r>
-      <w:proofErr w:type="spellStart"/>
-      <w:r>
-        <w:t>Collingridge</w:t>
-      </w:r>
-      <w:proofErr w:type="spellEnd"/>
-      <w:r>
-        <w:t xml:space="preserve">, K. (2015). Predicting Consumer Biomass, Size-Structure, Production, Catch Potential, Responses to Fishing and Associated Uncertainties in the World’s Marine Ecosystems. </w:t>
+        <w:t xml:space="preserve">Jennings, S. &amp; Collingridge, K. (2015). Predicting Consumer Biomass, Size-Structure, Production, Catch Potential, Responses to Fishing and Associated Uncertainties in the World’s Marine Ecosystems. </w:t>
       </w:r>
       <w:r>
         <w:rPr>
@@ -29610,47 +28908,11 @@
       <w:pPr>
         <w:pStyle w:val="Bibliography"/>
       </w:pPr>
-      <w:proofErr w:type="spellStart"/>
       <w:r>
         <w:rPr>
           <w:lang w:val="sv-SE"/>
         </w:rPr>
-        <w:t>Jorgensen</w:t>
-      </w:r>
-      <w:proofErr w:type="spellEnd"/>
-      <w:r>
-        <w:rPr>
-          <w:lang w:val="sv-SE"/>
-        </w:rPr>
-        <w:t xml:space="preserve">, C., Enberg, K., Dunlop, E.S., </w:t>
-      </w:r>
-      <w:proofErr w:type="spellStart"/>
-      <w:r>
-        <w:rPr>
-          <w:lang w:val="sv-SE"/>
-        </w:rPr>
-        <w:t>Arlinghaus</w:t>
-      </w:r>
-      <w:proofErr w:type="spellEnd"/>
-      <w:r>
-        <w:rPr>
-          <w:lang w:val="sv-SE"/>
-        </w:rPr>
-        <w:t xml:space="preserve">, R., </w:t>
-      </w:r>
-      <w:proofErr w:type="spellStart"/>
-      <w:r>
-        <w:rPr>
-          <w:lang w:val="sv-SE"/>
-        </w:rPr>
-        <w:t>Boukal</w:t>
-      </w:r>
-      <w:proofErr w:type="spellEnd"/>
-      <w:r>
-        <w:rPr>
-          <w:lang w:val="sv-SE"/>
-        </w:rPr>
-        <w:t xml:space="preserve">, D.S., Brander, K., </w:t>
+        <w:t xml:space="preserve">Jorgensen, C., Enberg, K., Dunlop, E.S., Arlinghaus, R., Boukal, D.S., Brander, K., </w:t>
       </w:r>
       <w:r>
         <w:rPr>
@@ -29685,15 +28947,7 @@
         <w:pStyle w:val="Bibliography"/>
       </w:pPr>
       <w:r>
-        <w:t xml:space="preserve">Kwiatkowski, L., Torres, O., Bopp, L., </w:t>
-      </w:r>
-      <w:proofErr w:type="spellStart"/>
-      <w:r>
-        <w:t>Aumont</w:t>
-      </w:r>
-      <w:proofErr w:type="spellEnd"/>
-      <w:r>
-        <w:t xml:space="preserve">, O., Chamberlain, M., Christian, J.R., </w:t>
+        <w:t xml:space="preserve">Kwiatkowski, L., Torres, O., Bopp, L., Aumont, O., Chamberlain, M., Christian, J.R., </w:t>
       </w:r>
       <w:r>
         <w:rPr>
@@ -29705,7 +28959,6 @@
       <w:r>
         <w:t xml:space="preserve"> (2020). Twenty-first century ocean warming, acidification, deoxygenation, and upper-ocean nutrient and primary production decline from CMIP6 model projections. </w:t>
       </w:r>
-      <w:proofErr w:type="spellStart"/>
       <w:r>
         <w:rPr>
           <w:i/>
@@ -29713,7 +28966,6 @@
         </w:rPr>
         <w:t>Biogeosciences</w:t>
       </w:r>
-      <w:proofErr w:type="spellEnd"/>
       <w:r>
         <w:t>, 17, 3439–3470.</w:t>
       </w:r>
@@ -29722,37 +28974,8 @@
       <w:pPr>
         <w:pStyle w:val="Bibliography"/>
       </w:pPr>
-      <w:proofErr w:type="spellStart"/>
-      <w:r>
-        <w:t>Lefort</w:t>
-      </w:r>
-      <w:proofErr w:type="spellEnd"/>
-      <w:r>
-        <w:t xml:space="preserve">, S., </w:t>
-      </w:r>
-      <w:proofErr w:type="spellStart"/>
-      <w:r>
-        <w:t>Aumont</w:t>
-      </w:r>
-      <w:proofErr w:type="spellEnd"/>
-      <w:r>
-        <w:t xml:space="preserve">, O., Bopp, L., </w:t>
-      </w:r>
-      <w:proofErr w:type="spellStart"/>
-      <w:r>
-        <w:t>Arsouze</w:t>
-      </w:r>
-      <w:proofErr w:type="spellEnd"/>
-      <w:r>
-        <w:t xml:space="preserve">, T., </w:t>
-      </w:r>
-      <w:proofErr w:type="spellStart"/>
-      <w:r>
-        <w:t>Gehlen</w:t>
-      </w:r>
-      <w:proofErr w:type="spellEnd"/>
-      <w:r>
-        <w:t xml:space="preserve">, M. &amp; Maury, O. (2015). Spatial and body-size dependent response of marine pelagic communities to projected global climate change. </w:t>
+      <w:r>
+        <w:t xml:space="preserve">Lefort, S., Aumont, O., Bopp, L., Arsouze, T., Gehlen, M. &amp; Maury, O. (2015). Spatial and body-size dependent response of marine pelagic communities to projected global climate change. </w:t>
       </w:r>
       <w:r>
         <w:rPr>
@@ -29770,23 +28993,7 @@
         <w:pStyle w:val="Bibliography"/>
       </w:pPr>
       <w:r>
-        <w:t xml:space="preserve">Lindmark, M., </w:t>
-      </w:r>
-      <w:proofErr w:type="spellStart"/>
-      <w:r>
-        <w:t>Ohlberger</w:t>
-      </w:r>
-      <w:proofErr w:type="spellEnd"/>
-      <w:r>
-        <w:t xml:space="preserve">, J. &amp; </w:t>
-      </w:r>
-      <w:proofErr w:type="spellStart"/>
-      <w:r>
-        <w:t>Gårdmark</w:t>
-      </w:r>
-      <w:proofErr w:type="spellEnd"/>
-      <w:r>
-        <w:t xml:space="preserve">, A. (2022). Optimum growth temperature declines with body size within fish species. </w:t>
+        <w:t xml:space="preserve">Lindmark, M., Ohlberger, J. &amp; Gårdmark, A. (2022). Optimum growth temperature declines with body size within fish species. </w:t>
       </w:r>
       <w:r>
         <w:rPr>
@@ -29804,15 +29011,7 @@
         <w:pStyle w:val="Bibliography"/>
       </w:pPr>
       <w:r>
-        <w:t xml:space="preserve">Lorenzen, K. (2016). Toward a new paradigm for growth </w:t>
-      </w:r>
-      <w:proofErr w:type="spellStart"/>
-      <w:r>
-        <w:t>modeling</w:t>
-      </w:r>
-      <w:proofErr w:type="spellEnd"/>
-      <w:r>
-        <w:t xml:space="preserve"> in fisheries stock assessments: Embracing plasticity and its consequences. </w:t>
+        <w:t xml:space="preserve">Lorenzen, K. (2016). Toward a new paradigm for growth modeling in fisheries stock assessments: Embracing plasticity and its consequences. </w:t>
       </w:r>
       <w:r>
         <w:rPr>
@@ -29829,29 +29028,8 @@
       <w:pPr>
         <w:pStyle w:val="Bibliography"/>
       </w:pPr>
-      <w:proofErr w:type="spellStart"/>
-      <w:r>
-        <w:t>Lotze</w:t>
-      </w:r>
-      <w:proofErr w:type="spellEnd"/>
-      <w:r>
-        <w:t xml:space="preserve">, H.K., </w:t>
-      </w:r>
-      <w:proofErr w:type="spellStart"/>
-      <w:r>
-        <w:t>Tittensor</w:t>
-      </w:r>
-      <w:proofErr w:type="spellEnd"/>
-      <w:r>
-        <w:t xml:space="preserve">, D.P., </w:t>
-      </w:r>
-      <w:proofErr w:type="spellStart"/>
-      <w:r>
-        <w:t>Bryndum</w:t>
-      </w:r>
-      <w:proofErr w:type="spellEnd"/>
-      <w:r>
-        <w:t xml:space="preserve">-Buchholz, A., Eddy, T.D., Cheung, W.W.L., Galbraith, E.D., </w:t>
+      <w:r>
+        <w:t xml:space="preserve">Lotze, H.K., Tittensor, D.P., Bryndum-Buchholz, A., Eddy, T.D., Cheung, W.W.L., Galbraith, E.D., </w:t>
       </w:r>
       <w:r>
         <w:rPr>
@@ -29879,39 +29057,7 @@
         <w:pStyle w:val="Bibliography"/>
       </w:pPr>
       <w:r>
-        <w:t xml:space="preserve">Mackenzie, B.R., </w:t>
-      </w:r>
-      <w:proofErr w:type="spellStart"/>
-      <w:r>
-        <w:t>Gislason</w:t>
-      </w:r>
-      <w:proofErr w:type="spellEnd"/>
-      <w:r>
-        <w:t xml:space="preserve">, H., </w:t>
-      </w:r>
-      <w:proofErr w:type="spellStart"/>
-      <w:r>
-        <w:t>Möllmann</w:t>
-      </w:r>
-      <w:proofErr w:type="spellEnd"/>
-      <w:r>
-        <w:t xml:space="preserve">, C. &amp; </w:t>
-      </w:r>
-      <w:proofErr w:type="spellStart"/>
-      <w:r>
-        <w:t>Köster</w:t>
-      </w:r>
-      <w:proofErr w:type="spellEnd"/>
-      <w:r>
-        <w:t xml:space="preserve">, F.W. (2007). Impact of 21st century climate change on the Baltic Sea </w:t>
-      </w:r>
-      <w:proofErr w:type="gramStart"/>
-      <w:r>
-        <w:t>fish</w:t>
-      </w:r>
-      <w:proofErr w:type="gramEnd"/>
-      <w:r>
-        <w:t xml:space="preserve"> community and fisheries. </w:t>
+        <w:t xml:space="preserve">Mackenzie, B.R., Gislason, H., Möllmann, C. &amp; Köster, F.W. (2007). Impact of 21st century climate change on the Baltic Sea fish community and fisheries. </w:t>
       </w:r>
       <w:r>
         <w:rPr>
@@ -29929,15 +29075,7 @@
         <w:pStyle w:val="Bibliography"/>
       </w:pPr>
       <w:r>
-        <w:t xml:space="preserve">McCauley, D.J., Pinsky, M.L., </w:t>
-      </w:r>
-      <w:proofErr w:type="spellStart"/>
-      <w:r>
-        <w:t>Palumbi</w:t>
-      </w:r>
-      <w:proofErr w:type="spellEnd"/>
-      <w:r>
-        <w:t xml:space="preserve">, S.R., Estes, J.A., Joyce, F.H. &amp; Warner, R.R. (2015). Marine defaunation: Animal loss in the global ocean. </w:t>
+        <w:t xml:space="preserve">McCauley, D.J., Pinsky, M.L., Palumbi, S.R., Estes, J.A., Joyce, F.H. &amp; Warner, R.R. (2015). Marine defaunation: Animal loss in the global ocean. </w:t>
       </w:r>
       <w:r>
         <w:rPr>
@@ -29958,44 +29096,16 @@
         </w:rPr>
       </w:pPr>
       <w:r>
-        <w:t xml:space="preserve">McCoy, M.W. &amp; </w:t>
-      </w:r>
-      <w:proofErr w:type="spellStart"/>
-      <w:r>
-        <w:t>Gillooly</w:t>
-      </w:r>
-      <w:proofErr w:type="spellEnd"/>
-      <w:r>
-        <w:t xml:space="preserve">, J.F. (2008). Predicting natural mortality rates of plants and animals. </w:t>
-      </w:r>
-      <w:proofErr w:type="spellStart"/>
+        <w:t xml:space="preserve">McCoy, M.W. &amp; Gillooly, J.F. (2008). Predicting natural mortality rates of plants and animals. </w:t>
+      </w:r>
       <w:r>
         <w:rPr>
           <w:i/>
           <w:iCs/>
           <w:lang w:val="sv-SE"/>
         </w:rPr>
-        <w:t>Ecology</w:t>
-      </w:r>
-      <w:proofErr w:type="spellEnd"/>
-      <w:r>
-        <w:rPr>
-          <w:i/>
-          <w:iCs/>
-          <w:lang w:val="sv-SE"/>
-        </w:rPr>
-        <w:t xml:space="preserve"> </w:t>
-      </w:r>
-      <w:proofErr w:type="gramStart"/>
-      <w:r>
-        <w:rPr>
-          <w:i/>
-          <w:iCs/>
-          <w:lang w:val="sv-SE"/>
-        </w:rPr>
-        <w:t>Letters</w:t>
-      </w:r>
-      <w:proofErr w:type="gramEnd"/>
+        <w:t>Ecology Letters</w:t>
+      </w:r>
       <w:r>
         <w:rPr>
           <w:lang w:val="sv-SE"/>
@@ -30007,94 +29117,28 @@
       <w:pPr>
         <w:pStyle w:val="Bibliography"/>
       </w:pPr>
-      <w:proofErr w:type="spellStart"/>
       <w:r>
         <w:rPr>
           <w:lang w:val="sv-SE"/>
         </w:rPr>
-        <w:t>Mion</w:t>
-      </w:r>
-      <w:proofErr w:type="spellEnd"/>
-      <w:r>
-        <w:rPr>
+        <w:t xml:space="preserve">Mion, M., Haase, S., Hemmer‐Hansen, J., Hilvarsson, A., Hüssy, K., Krüger‐Johnsen, M., </w:t>
+      </w:r>
+      <w:r>
+        <w:rPr>
+          <w:i/>
+          <w:iCs/>
           <w:lang w:val="sv-SE"/>
         </w:rPr>
-        <w:t xml:space="preserve">, M., </w:t>
-      </w:r>
-      <w:proofErr w:type="spellStart"/>
+        <w:t>et al.</w:t>
+      </w:r>
       <w:r>
         <w:rPr>
           <w:lang w:val="sv-SE"/>
         </w:rPr>
-        <w:t>Haase</w:t>
-      </w:r>
-      <w:proofErr w:type="spellEnd"/>
-      <w:r>
-        <w:rPr>
-          <w:lang w:val="sv-SE"/>
-        </w:rPr>
-        <w:t xml:space="preserve">, S., Hemmer‐Hansen, J., </w:t>
-      </w:r>
-      <w:proofErr w:type="spellStart"/>
-      <w:r>
-        <w:rPr>
-          <w:lang w:val="sv-SE"/>
-        </w:rPr>
-        <w:t>Hilvarsson</w:t>
-      </w:r>
-      <w:proofErr w:type="spellEnd"/>
-      <w:r>
-        <w:rPr>
-          <w:lang w:val="sv-SE"/>
-        </w:rPr>
-        <w:t xml:space="preserve">, A., </w:t>
-      </w:r>
-      <w:proofErr w:type="spellStart"/>
-      <w:r>
-        <w:rPr>
-          <w:lang w:val="sv-SE"/>
-        </w:rPr>
-        <w:t>Hüssy</w:t>
-      </w:r>
-      <w:proofErr w:type="spellEnd"/>
-      <w:r>
-        <w:rPr>
-          <w:lang w:val="sv-SE"/>
-        </w:rPr>
-        <w:t xml:space="preserve">, K., Krüger‐Johnsen, M., </w:t>
-      </w:r>
-      <w:r>
-        <w:rPr>
-          <w:i/>
-          <w:iCs/>
-          <w:lang w:val="sv-SE"/>
-        </w:rPr>
-        <w:t>et al.</w:t>
-      </w:r>
-      <w:r>
-        <w:rPr>
-          <w:lang w:val="sv-SE"/>
-        </w:rPr>
         <w:t xml:space="preserve"> </w:t>
       </w:r>
       <w:r>
-        <w:t xml:space="preserve">(2021). Multidecadal changes in fish growth rates estimated from tagging data: A case study from the Eastern Baltic cod (Gadus </w:t>
-      </w:r>
-      <w:proofErr w:type="spellStart"/>
-      <w:r>
-        <w:t>morhua</w:t>
-      </w:r>
-      <w:proofErr w:type="spellEnd"/>
-      <w:r>
-        <w:t xml:space="preserve">, </w:t>
-      </w:r>
-      <w:proofErr w:type="spellStart"/>
-      <w:r>
-        <w:t>Gadidae</w:t>
-      </w:r>
-      <w:proofErr w:type="spellEnd"/>
-      <w:r>
-        <w:t xml:space="preserve">). </w:t>
+        <w:t xml:space="preserve">(2021). Multidecadal changes in fish growth rates estimated from tagging data: A case study from the Eastern Baltic cod (Gadus morhua, Gadidae). </w:t>
       </w:r>
       <w:r>
         <w:rPr>
@@ -30111,21 +29155,8 @@
       <w:pPr>
         <w:pStyle w:val="Bibliography"/>
       </w:pPr>
-      <w:proofErr w:type="spellStart"/>
-      <w:r>
-        <w:t>Mion</w:t>
-      </w:r>
-      <w:proofErr w:type="spellEnd"/>
-      <w:r>
-        <w:t xml:space="preserve">, M., Thorsen, A., Vitale, F., Dierking, J., Herrmann, J.P., </w:t>
-      </w:r>
-      <w:proofErr w:type="spellStart"/>
-      <w:r>
-        <w:t>Huwer</w:t>
-      </w:r>
-      <w:proofErr w:type="spellEnd"/>
-      <w:r>
-        <w:t xml:space="preserve">, B., </w:t>
+      <w:r>
+        <w:t xml:space="preserve">Mion, M., Thorsen, A., Vitale, F., Dierking, J., Herrmann, J.P., Huwer, B., </w:t>
       </w:r>
       <w:r>
         <w:rPr>
@@ -30142,17 +29173,8 @@
           <w:i/>
           <w:iCs/>
         </w:rPr>
-        <w:t xml:space="preserve">Gadus </w:t>
-      </w:r>
-      <w:proofErr w:type="spellStart"/>
-      <w:r>
-        <w:rPr>
-          <w:i/>
-          <w:iCs/>
-        </w:rPr>
-        <w:t>morhua</w:t>
-      </w:r>
-      <w:proofErr w:type="spellEnd"/>
+        <w:t>Gadus morhua</w:t>
+      </w:r>
       <w:r>
         <w:t xml:space="preserve"> from the Baltic Sea: POTENTIAL FECUNDITY OF BALTIC </w:t>
       </w:r>
@@ -30181,46 +29203,9 @@
       <w:pPr>
         <w:pStyle w:val="Bibliography"/>
       </w:pPr>
-      <w:proofErr w:type="spellStart"/>
       <w:r>
         <w:lastRenderedPageBreak/>
-        <w:t>Möllmann</w:t>
-      </w:r>
-      <w:proofErr w:type="spellEnd"/>
-      <w:r>
-        <w:t xml:space="preserve">, C., </w:t>
-      </w:r>
-      <w:proofErr w:type="spellStart"/>
-      <w:r>
-        <w:t>Diekmann</w:t>
-      </w:r>
-      <w:proofErr w:type="spellEnd"/>
-      <w:r>
-        <w:t>, R., Müller‐</w:t>
-      </w:r>
-      <w:proofErr w:type="spellStart"/>
-      <w:r>
-        <w:t>Karulis</w:t>
-      </w:r>
-      <w:proofErr w:type="spellEnd"/>
-      <w:r>
-        <w:t xml:space="preserve">, B., </w:t>
-      </w:r>
-      <w:proofErr w:type="spellStart"/>
-      <w:r>
-        <w:t>Kornilovs</w:t>
-      </w:r>
-      <w:proofErr w:type="spellEnd"/>
-      <w:r>
-        <w:t xml:space="preserve">, G., </w:t>
-      </w:r>
-      <w:proofErr w:type="spellStart"/>
-      <w:r>
-        <w:t>Plikshs</w:t>
-      </w:r>
-      <w:proofErr w:type="spellEnd"/>
-      <w:r>
-        <w:t xml:space="preserve">, M. &amp; Axe, P. (2009). Reorganization of a large marine ecosystem due to atmospheric and anthropogenic pressure: a discontinuous regime shift in the Central Baltic Sea. </w:t>
+        <w:t xml:space="preserve">Möllmann, C., Diekmann, R., Müller‐Karulis, B., Kornilovs, G., Plikshs, M. &amp; Axe, P. (2009). Reorganization of a large marine ecosystem due to atmospheric and anthropogenic pressure: a discontinuous regime shift in the Central Baltic Sea. </w:t>
       </w:r>
       <w:r>
         <w:rPr>
@@ -30237,13 +29222,8 @@
       <w:pPr>
         <w:pStyle w:val="Bibliography"/>
       </w:pPr>
-      <w:proofErr w:type="spellStart"/>
-      <w:r>
-        <w:t>Morán</w:t>
-      </w:r>
-      <w:proofErr w:type="spellEnd"/>
-      <w:r>
-        <w:t xml:space="preserve">, X.A.G., López‐Urrutia, Á., Calvo‐Díaz, A. &amp; Li, W.K.W. (2010). Increasing importance of small phytoplankton in a warmer ocean. </w:t>
+      <w:r>
+        <w:t xml:space="preserve">Morán, X.A.G., López‐Urrutia, Á., Calvo‐Díaz, A. &amp; Li, W.K.W. (2010). Increasing importance of small phytoplankton in a warmer ocean. </w:t>
       </w:r>
       <w:r>
         <w:rPr>
@@ -30264,35 +29244,7 @@
         <w:rPr>
           <w:lang w:val="sv-SE"/>
         </w:rPr>
-        <w:t xml:space="preserve">Morita, K., </w:t>
-      </w:r>
-      <w:proofErr w:type="spellStart"/>
-      <w:r>
-        <w:rPr>
-          <w:lang w:val="sv-SE"/>
-        </w:rPr>
-        <w:t>Fukuwaka</w:t>
-      </w:r>
-      <w:proofErr w:type="spellEnd"/>
-      <w:r>
-        <w:rPr>
-          <w:lang w:val="sv-SE"/>
-        </w:rPr>
-        <w:t xml:space="preserve">, M., Tanimata, N. &amp; </w:t>
-      </w:r>
-      <w:proofErr w:type="spellStart"/>
-      <w:r>
-        <w:rPr>
-          <w:lang w:val="sv-SE"/>
-        </w:rPr>
-        <w:t>Yamamura</w:t>
-      </w:r>
-      <w:proofErr w:type="spellEnd"/>
-      <w:r>
-        <w:rPr>
-          <w:lang w:val="sv-SE"/>
-        </w:rPr>
-        <w:t xml:space="preserve">, O. (2010). </w:t>
+        <w:t xml:space="preserve">Morita, K., Fukuwaka, M., Tanimata, N. &amp; Yamamura, O. (2010). </w:t>
       </w:r>
       <w:r>
         <w:t xml:space="preserve">Size-dependent thermal preferences in a pelagic fish. </w:t>
@@ -30334,44 +29286,16 @@
         </w:rPr>
       </w:pPr>
       <w:r>
-        <w:t xml:space="preserve">Neubauer, P. &amp; Andersen, K.H. (2019). Thermal performance of fish is explained by an interplay between physiology, </w:t>
-      </w:r>
-      <w:proofErr w:type="gramStart"/>
-      <w:r>
-        <w:t>behaviour</w:t>
-      </w:r>
-      <w:proofErr w:type="gramEnd"/>
-      <w:r>
-        <w:t xml:space="preserve"> and ecology. </w:t>
-      </w:r>
-      <w:proofErr w:type="spellStart"/>
+        <w:t xml:space="preserve">Neubauer, P. &amp; Andersen, K.H. (2019). Thermal performance of fish is explained by an interplay between physiology, behaviour and ecology. </w:t>
+      </w:r>
       <w:r>
         <w:rPr>
           <w:i/>
           <w:iCs/>
           <w:lang w:val="sv-SE"/>
         </w:rPr>
-        <w:t>Conserv</w:t>
-      </w:r>
-      <w:proofErr w:type="spellEnd"/>
-      <w:r>
-        <w:rPr>
-          <w:i/>
-          <w:iCs/>
-          <w:lang w:val="sv-SE"/>
-        </w:rPr>
-        <w:t xml:space="preserve"> </w:t>
-      </w:r>
-      <w:proofErr w:type="spellStart"/>
-      <w:r>
-        <w:rPr>
-          <w:i/>
-          <w:iCs/>
-          <w:lang w:val="sv-SE"/>
-        </w:rPr>
-        <w:t>Physiol</w:t>
-      </w:r>
-      <w:proofErr w:type="spellEnd"/>
+        <w:t>Conserv Physiol</w:t>
+      </w:r>
       <w:r>
         <w:rPr>
           <w:lang w:val="sv-SE"/>
@@ -30383,60 +29307,24 @@
       <w:pPr>
         <w:pStyle w:val="Bibliography"/>
       </w:pPr>
-      <w:proofErr w:type="spellStart"/>
       <w:r>
         <w:rPr>
           <w:lang w:val="sv-SE"/>
         </w:rPr>
-        <w:t>Neuenfeldt</w:t>
-      </w:r>
-      <w:proofErr w:type="spellEnd"/>
-      <w:r>
-        <w:rPr>
+        <w:t xml:space="preserve">Neuenfeldt, S., Bartolino, V., Orio, A., Andersen, K.H., Andersen, N.G., Niiranen, S., </w:t>
+      </w:r>
+      <w:r>
+        <w:rPr>
+          <w:i/>
+          <w:iCs/>
           <w:lang w:val="sv-SE"/>
         </w:rPr>
-        <w:t xml:space="preserve">, S., </w:t>
-      </w:r>
-      <w:proofErr w:type="spellStart"/>
+        <w:t>et al.</w:t>
+      </w:r>
       <w:r>
         <w:rPr>
           <w:lang w:val="sv-SE"/>
         </w:rPr>
-        <w:t>Bartolino</w:t>
-      </w:r>
-      <w:proofErr w:type="spellEnd"/>
-      <w:r>
-        <w:rPr>
-          <w:lang w:val="sv-SE"/>
-        </w:rPr>
-        <w:t xml:space="preserve">, V., </w:t>
-      </w:r>
-      <w:proofErr w:type="spellStart"/>
-      <w:r>
-        <w:rPr>
-          <w:lang w:val="sv-SE"/>
-        </w:rPr>
-        <w:t>Orio</w:t>
-      </w:r>
-      <w:proofErr w:type="spellEnd"/>
-      <w:r>
-        <w:rPr>
-          <w:lang w:val="sv-SE"/>
-        </w:rPr>
-        <w:t xml:space="preserve">, A., Andersen, K.H., Andersen, N.G., Niiranen, S., </w:t>
-      </w:r>
-      <w:r>
-        <w:rPr>
-          <w:i/>
-          <w:iCs/>
-          <w:lang w:val="sv-SE"/>
-        </w:rPr>
-        <w:t>et al.</w:t>
-      </w:r>
-      <w:r>
-        <w:rPr>
-          <w:lang w:val="sv-SE"/>
-        </w:rPr>
         <w:t xml:space="preserve"> </w:t>
       </w:r>
       <w:r>
@@ -30447,17 +29335,8 @@
           <w:i/>
           <w:iCs/>
         </w:rPr>
-        <w:t xml:space="preserve">Gadus </w:t>
-      </w:r>
-      <w:proofErr w:type="spellStart"/>
-      <w:r>
-        <w:rPr>
-          <w:i/>
-          <w:iCs/>
-        </w:rPr>
-        <w:t>morhua</w:t>
-      </w:r>
-      <w:proofErr w:type="spellEnd"/>
+        <w:t>Gadus morhua</w:t>
+      </w:r>
       <w:r>
         <w:t xml:space="preserve"> L.) in the eastern Baltic Sea under environmental change. </w:t>
       </w:r>
@@ -30476,21 +29355,8 @@
       <w:pPr>
         <w:pStyle w:val="Bibliography"/>
       </w:pPr>
-      <w:proofErr w:type="spellStart"/>
-      <w:r>
-        <w:t>Neuheimer</w:t>
-      </w:r>
-      <w:proofErr w:type="spellEnd"/>
-      <w:r>
-        <w:t xml:space="preserve">, A.B. &amp; </w:t>
-      </w:r>
-      <w:proofErr w:type="spellStart"/>
-      <w:r>
-        <w:t>Grønkjaer</w:t>
-      </w:r>
-      <w:proofErr w:type="spellEnd"/>
-      <w:r>
-        <w:t xml:space="preserve">, P. (2012). Climate effects on size-at-age: growth in warming waters compensates for earlier maturity in an exploited marine fish. </w:t>
+      <w:r>
+        <w:t xml:space="preserve">Neuheimer, A.B. &amp; Grønkjaer, P. (2012). Climate effects on size-at-age: growth in warming waters compensates for earlier maturity in an exploited marine fish. </w:t>
       </w:r>
       <w:r>
         <w:rPr>
@@ -30507,13 +29373,8 @@
       <w:pPr>
         <w:pStyle w:val="Bibliography"/>
       </w:pPr>
-      <w:proofErr w:type="spellStart"/>
-      <w:r>
-        <w:t>Neuheimer</w:t>
-      </w:r>
-      <w:proofErr w:type="spellEnd"/>
-      <w:r>
-        <w:t xml:space="preserve">, A.B., Thresher, R.E., Lyle, J.M. &amp; Semmens, J.M. (2011). Tolerance limit for fish growth exceeded by warming waters. </w:t>
+      <w:r>
+        <w:t xml:space="preserve">Neuheimer, A.B., Thresher, R.E., Lyle, J.M. &amp; Semmens, J.M. (2011). Tolerance limit for fish growth exceeded by warming waters. </w:t>
       </w:r>
       <w:r>
         <w:rPr>
@@ -30530,13 +29391,8 @@
       <w:pPr>
         <w:pStyle w:val="Bibliography"/>
       </w:pPr>
-      <w:proofErr w:type="spellStart"/>
-      <w:r>
-        <w:t>Ohlberger</w:t>
-      </w:r>
-      <w:proofErr w:type="spellEnd"/>
-      <w:r>
-        <w:t xml:space="preserve">, J. (2013). Climate warming and ectotherm body size – from individual physiology to community ecology. </w:t>
+      <w:r>
+        <w:t xml:space="preserve">Ohlberger, J. (2013). Climate warming and ectotherm body size – from individual physiology to community ecology. </w:t>
       </w:r>
       <w:r>
         <w:rPr>
@@ -30553,37 +29409,8 @@
       <w:pPr>
         <w:pStyle w:val="Bibliography"/>
       </w:pPr>
-      <w:proofErr w:type="spellStart"/>
-      <w:r>
-        <w:t>Ohlberger</w:t>
-      </w:r>
-      <w:proofErr w:type="spellEnd"/>
-      <w:r>
-        <w:t xml:space="preserve">, J., </w:t>
-      </w:r>
-      <w:proofErr w:type="spellStart"/>
-      <w:r>
-        <w:t>Edeline</w:t>
-      </w:r>
-      <w:proofErr w:type="spellEnd"/>
-      <w:r>
-        <w:t xml:space="preserve">, E., </w:t>
-      </w:r>
-      <w:proofErr w:type="spellStart"/>
-      <w:r>
-        <w:t>Vollestad</w:t>
-      </w:r>
-      <w:proofErr w:type="spellEnd"/>
-      <w:r>
-        <w:t xml:space="preserve">, L.A., </w:t>
-      </w:r>
-      <w:proofErr w:type="spellStart"/>
-      <w:r>
-        <w:t>Stenseth</w:t>
-      </w:r>
-      <w:proofErr w:type="spellEnd"/>
-      <w:r>
-        <w:t xml:space="preserve">, N.C. &amp; Claessen, D. (2011). Temperature-driven regime shifts in the dynamics of size-structured populations. </w:t>
+      <w:r>
+        <w:t xml:space="preserve">Ohlberger, J., Edeline, E., Vollestad, L.A., Stenseth, N.C. &amp; Claessen, D. (2011). Temperature-driven regime shifts in the dynamics of size-structured populations. </w:t>
       </w:r>
       <w:r>
         <w:rPr>
@@ -30636,37 +29463,8 @@
       <w:pPr>
         <w:pStyle w:val="Bibliography"/>
       </w:pPr>
-      <w:proofErr w:type="spellStart"/>
-      <w:r>
-        <w:t>Pontavice</w:t>
-      </w:r>
-      <w:proofErr w:type="spellEnd"/>
-      <w:r>
-        <w:t xml:space="preserve">, H. du, </w:t>
-      </w:r>
-      <w:proofErr w:type="spellStart"/>
-      <w:r>
-        <w:t>Gascuel</w:t>
-      </w:r>
-      <w:proofErr w:type="spellEnd"/>
-      <w:r>
-        <w:t xml:space="preserve">, D., </w:t>
-      </w:r>
-      <w:proofErr w:type="spellStart"/>
-      <w:r>
-        <w:t>Reygondeau</w:t>
-      </w:r>
-      <w:proofErr w:type="spellEnd"/>
-      <w:r>
-        <w:t xml:space="preserve">, G., </w:t>
-      </w:r>
-      <w:proofErr w:type="spellStart"/>
-      <w:r>
-        <w:t>Maureaud</w:t>
-      </w:r>
-      <w:proofErr w:type="spellEnd"/>
-      <w:r>
-        <w:t xml:space="preserve">, A. &amp; Cheung, W.W.L. (2019). Climate change undermines the global functioning of marine food webs. </w:t>
+      <w:r>
+        <w:t xml:space="preserve">Pontavice, H. du, Gascuel, D., Reygondeau, G., Maureaud, A. &amp; Cheung, W.W.L. (2019). Climate change undermines the global functioning of marine food webs. </w:t>
       </w:r>
       <w:r>
         <w:rPr>
@@ -30701,45 +29499,8 @@
       <w:pPr>
         <w:pStyle w:val="Bibliography"/>
       </w:pPr>
-      <w:proofErr w:type="spellStart"/>
-      <w:r>
-        <w:t>Rall</w:t>
-      </w:r>
-      <w:proofErr w:type="spellEnd"/>
-      <w:r>
-        <w:t xml:space="preserve">, B.C., Brose, U., </w:t>
-      </w:r>
-      <w:proofErr w:type="spellStart"/>
-      <w:r>
-        <w:t>Hartvig</w:t>
-      </w:r>
-      <w:proofErr w:type="spellEnd"/>
-      <w:r>
-        <w:t xml:space="preserve">, M., </w:t>
-      </w:r>
-      <w:proofErr w:type="spellStart"/>
-      <w:r>
-        <w:t>Kalinkat</w:t>
-      </w:r>
-      <w:proofErr w:type="spellEnd"/>
-      <w:r>
-        <w:t xml:space="preserve">, G., </w:t>
-      </w:r>
-      <w:proofErr w:type="spellStart"/>
-      <w:r>
-        <w:t>Schwarzmuller</w:t>
-      </w:r>
-      <w:proofErr w:type="spellEnd"/>
-      <w:r>
-        <w:t>, F., Vucic-</w:t>
-      </w:r>
-      <w:proofErr w:type="spellStart"/>
-      <w:r>
-        <w:t>Pestic</w:t>
-      </w:r>
-      <w:proofErr w:type="spellEnd"/>
-      <w:r>
-        <w:t xml:space="preserve">, O., </w:t>
+      <w:r>
+        <w:t xml:space="preserve">Rall, B.C., Brose, U., Hartvig, M., Kalinkat, G., Schwarzmuller, F., Vucic-Pestic, O., </w:t>
       </w:r>
       <w:r>
         <w:rPr>
@@ -30766,21 +29527,8 @@
       <w:pPr>
         <w:pStyle w:val="Bibliography"/>
       </w:pPr>
-      <w:proofErr w:type="spellStart"/>
-      <w:r>
-        <w:t>Reum</w:t>
-      </w:r>
-      <w:proofErr w:type="spellEnd"/>
-      <w:r>
-        <w:t xml:space="preserve">, J.C.P., Blanchard, J.L., </w:t>
-      </w:r>
-      <w:proofErr w:type="spellStart"/>
-      <w:r>
-        <w:t>Holsman</w:t>
-      </w:r>
-      <w:proofErr w:type="spellEnd"/>
-      <w:r>
-        <w:t xml:space="preserve">, K.K., Aydin, K. &amp; Punt, A.E. (2019). Species‐specific ontogenetic diet shifts attenuate trophic cascades and lengthen food chains in exploited ecosystems. </w:t>
+      <w:r>
+        <w:t xml:space="preserve">Reum, J.C.P., Blanchard, J.L., Holsman, K.K., Aydin, K. &amp; Punt, A.E. (2019). Species‐specific ontogenetic diet shifts attenuate trophic cascades and lengthen food chains in exploited ecosystems. </w:t>
       </w:r>
       <w:r>
         <w:rPr>
@@ -30798,41 +29546,7 @@
         <w:pStyle w:val="Bibliography"/>
       </w:pPr>
       <w:r>
-        <w:t xml:space="preserve">Righton, D.A., Andersen, </w:t>
-      </w:r>
-      <w:proofErr w:type="spellStart"/>
-      <w:proofErr w:type="gramStart"/>
-      <w:r>
-        <w:t>K.Haste</w:t>
-      </w:r>
-      <w:proofErr w:type="spellEnd"/>
-      <w:proofErr w:type="gramEnd"/>
-      <w:r>
-        <w:t xml:space="preserve">., Neat, F., </w:t>
-      </w:r>
-      <w:proofErr w:type="spellStart"/>
-      <w:r>
-        <w:t>Thorsteinsson</w:t>
-      </w:r>
-      <w:proofErr w:type="spellEnd"/>
-      <w:r>
-        <w:t xml:space="preserve">, V., </w:t>
-      </w:r>
-      <w:proofErr w:type="spellStart"/>
-      <w:r>
-        <w:t>Steingrund</w:t>
-      </w:r>
-      <w:proofErr w:type="spellEnd"/>
-      <w:r>
-        <w:t xml:space="preserve">, P., </w:t>
-      </w:r>
-      <w:proofErr w:type="spellStart"/>
-      <w:r>
-        <w:t>Svedäng</w:t>
-      </w:r>
-      <w:proofErr w:type="spellEnd"/>
-      <w:r>
-        <w:t xml:space="preserve">, H., </w:t>
+        <w:t xml:space="preserve">Righton, D.A., Andersen, K.Haste., Neat, F., Thorsteinsson, V., Steingrund, P., Svedäng, H., </w:t>
       </w:r>
       <w:r>
         <w:rPr>
@@ -30842,23 +29556,7 @@
         <w:t>et al.</w:t>
       </w:r>
       <w:r>
-        <w:t xml:space="preserve"> (2010). Thermal niche of Atlantic cod Gadus </w:t>
-      </w:r>
-      <w:proofErr w:type="spellStart"/>
-      <w:r>
-        <w:t>morhua</w:t>
-      </w:r>
-      <w:proofErr w:type="spellEnd"/>
-      <w:r>
-        <w:t xml:space="preserve">: limits, </w:t>
-      </w:r>
-      <w:proofErr w:type="gramStart"/>
-      <w:r>
-        <w:t>tolerance</w:t>
-      </w:r>
-      <w:proofErr w:type="gramEnd"/>
-      <w:r>
-        <w:t xml:space="preserve"> and optima. </w:t>
+        <w:t xml:space="preserve"> (2010). Thermal niche of Atlantic cod Gadus morhua: limits, tolerance and optima. </w:t>
       </w:r>
       <w:r>
         <w:rPr>
@@ -30876,31 +29574,7 @@
         <w:pStyle w:val="Bibliography"/>
       </w:pPr>
       <w:r>
-        <w:t xml:space="preserve">van Rijn, I., </w:t>
-      </w:r>
-      <w:proofErr w:type="spellStart"/>
-      <w:r>
-        <w:t>Buba</w:t>
-      </w:r>
-      <w:proofErr w:type="spellEnd"/>
-      <w:r>
-        <w:t xml:space="preserve">, Y., DeLong, J., </w:t>
-      </w:r>
-      <w:proofErr w:type="spellStart"/>
-      <w:r>
-        <w:t>Kiflawi</w:t>
-      </w:r>
-      <w:proofErr w:type="spellEnd"/>
-      <w:r>
-        <w:t xml:space="preserve">, M. &amp; </w:t>
-      </w:r>
-      <w:proofErr w:type="spellStart"/>
-      <w:r>
-        <w:t>Belmaker</w:t>
-      </w:r>
-      <w:proofErr w:type="spellEnd"/>
-      <w:r>
-        <w:t xml:space="preserve">, J. (2017). Large but uneven reduction in fish size across species in relation to changing sea temperatures. </w:t>
+        <w:t xml:space="preserve">van Rijn, I., Buba, Y., DeLong, J., Kiflawi, M. &amp; Belmaker, J. (2017). Large but uneven reduction in fish size across species in relation to changing sea temperatures. </w:t>
       </w:r>
       <w:r>
         <w:rPr>
@@ -30921,37 +29595,12 @@
         <w:lastRenderedPageBreak/>
         <w:t xml:space="preserve">Rohatgi, A. (2012). </w:t>
       </w:r>
-      <w:proofErr w:type="spellStart"/>
-      <w:r>
-        <w:rPr>
-          <w:i/>
-          <w:iCs/>
-        </w:rPr>
-        <w:t>WebPlotDigitalizer</w:t>
-      </w:r>
-      <w:proofErr w:type="spellEnd"/>
-      <w:r>
-        <w:rPr>
-          <w:i/>
-          <w:iCs/>
-        </w:rPr>
-        <w:t xml:space="preserve">: HTML5 based online tool to extract numerical data from plot images. Version 4.1. [WWW document] URL https://automeris.io/WebPlotDigitizer (accessed </w:t>
-      </w:r>
-      <w:proofErr w:type="gramStart"/>
-      <w:r>
-        <w:rPr>
-          <w:i/>
-          <w:iCs/>
-        </w:rPr>
-        <w:t>on</w:t>
-      </w:r>
-      <w:proofErr w:type="gramEnd"/>
-      <w:r>
-        <w:rPr>
-          <w:i/>
-          <w:iCs/>
-        </w:rPr>
-        <w:t xml:space="preserve"> January 2019).</w:t>
+      <w:r>
+        <w:rPr>
+          <w:i/>
+          <w:iCs/>
+        </w:rPr>
+        <w:t>WebPlotDigitalizer: HTML5 based online tool to extract numerical data from plot images. Version 4.1. [WWW document] URL https://automeris.io/WebPlotDigitizer (accessed on January 2019).</w:t>
       </w:r>
     </w:p>
     <w:p>
@@ -30959,23 +29608,7 @@
         <w:pStyle w:val="Bibliography"/>
       </w:pPr>
       <w:r>
-        <w:t xml:space="preserve">Savage, V.M., </w:t>
-      </w:r>
-      <w:proofErr w:type="spellStart"/>
-      <w:r>
-        <w:t>Gillooly</w:t>
-      </w:r>
-      <w:proofErr w:type="spellEnd"/>
-      <w:r>
-        <w:t xml:space="preserve">, J.F., Brown, J.H., West, G.B. &amp; </w:t>
-      </w:r>
-      <w:proofErr w:type="spellStart"/>
-      <w:r>
-        <w:t>Charnov</w:t>
-      </w:r>
-      <w:proofErr w:type="spellEnd"/>
-      <w:r>
-        <w:t xml:space="preserve">, E.L. (2004). Effects of body size and temperature on population growth. </w:t>
+        <w:t xml:space="preserve">Savage, V.M., Gillooly, J.F., Brown, J.H., West, G.B. &amp; Charnov, E.L. (2004). Effects of body size and temperature on population growth. </w:t>
       </w:r>
       <w:r>
         <w:rPr>
@@ -30995,61 +29628,23 @@
       <w:r>
         <w:t xml:space="preserve">Scott, F., Blanchard, J. &amp; Andersen, K. (2019). </w:t>
       </w:r>
-      <w:proofErr w:type="spellStart"/>
-      <w:r>
-        <w:rPr>
-          <w:i/>
-          <w:iCs/>
-        </w:rPr>
-        <w:t>mizer</w:t>
-      </w:r>
-      <w:proofErr w:type="spellEnd"/>
-      <w:r>
-        <w:rPr>
-          <w:i/>
-          <w:iCs/>
-        </w:rPr>
-        <w:t xml:space="preserve">: Multi-Species </w:t>
-      </w:r>
-      <w:proofErr w:type="spellStart"/>
-      <w:r>
-        <w:rPr>
-          <w:i/>
-          <w:iCs/>
-        </w:rPr>
-        <w:t>sIZE</w:t>
-      </w:r>
-      <w:proofErr w:type="spellEnd"/>
-      <w:r>
-        <w:rPr>
-          <w:i/>
-          <w:iCs/>
-        </w:rPr>
-        <w:t xml:space="preserve"> Spectrum Modelling in R</w:t>
-      </w:r>
-      <w:r>
-        <w:t xml:space="preserve">. </w:t>
-      </w:r>
-      <w:proofErr w:type="gramStart"/>
-      <w:r>
-        <w:t>R. .</w:t>
-      </w:r>
-      <w:proofErr w:type="gramEnd"/>
+      <w:r>
+        <w:rPr>
+          <w:i/>
+          <w:iCs/>
+        </w:rPr>
+        <w:t>mizer: Multi-Species sIZE Spectrum Modelling in R</w:t>
+      </w:r>
+      <w:r>
+        <w:t>. R. .</w:t>
+      </w:r>
     </w:p>
     <w:p>
       <w:pPr>
         <w:pStyle w:val="Bibliography"/>
       </w:pPr>
       <w:r>
-        <w:t xml:space="preserve">Scott, F., Blanchard, J.L. &amp; Andersen, K.H. (2014). </w:t>
-      </w:r>
-      <w:proofErr w:type="spellStart"/>
-      <w:r>
-        <w:t>mizer</w:t>
-      </w:r>
-      <w:proofErr w:type="spellEnd"/>
-      <w:r>
-        <w:t xml:space="preserve">: An R package for multispecies, trait-based and community size spectrum ecological modelling. </w:t>
+        <w:t xml:space="preserve">Scott, F., Blanchard, J.L. &amp; Andersen, K.H. (2014). mizer: An R package for multispecies, trait-based and community size spectrum ecological modelling. </w:t>
       </w:r>
       <w:r>
         <w:rPr>
@@ -31067,30 +29662,7 @@
         <w:pStyle w:val="Bibliography"/>
       </w:pPr>
       <w:r>
-        <w:t xml:space="preserve">Scott, F., Blanchard, J.L. &amp; Andersen, </w:t>
-      </w:r>
-      <w:proofErr w:type="spellStart"/>
-      <w:proofErr w:type="gramStart"/>
-      <w:r>
-        <w:t>K.Haste</w:t>
-      </w:r>
-      <w:proofErr w:type="spellEnd"/>
-      <w:proofErr w:type="gramEnd"/>
-      <w:r>
-        <w:t xml:space="preserve">. (2018). Multispecies, trait and community size spectrum ecological modelling in R </w:t>
-      </w:r>
-      <w:proofErr w:type="gramStart"/>
-      <w:r>
-        <w:t xml:space="preserve">( </w:t>
-      </w:r>
-      <w:proofErr w:type="spellStart"/>
-      <w:r>
-        <w:t>mizer</w:t>
-      </w:r>
-      <w:proofErr w:type="spellEnd"/>
-      <w:proofErr w:type="gramEnd"/>
-      <w:r>
-        <w:t xml:space="preserve"> ), 1–87.</w:t>
+        <w:t>Scott, F., Blanchard, J.L. &amp; Andersen, K.Haste. (2018). Multispecies, trait and community size spectrum ecological modelling in R ( mizer ), 1–87.</w:t>
       </w:r>
     </w:p>
     <w:p>
@@ -31115,45 +29687,8 @@
       <w:pPr>
         <w:pStyle w:val="Bibliography"/>
       </w:pPr>
-      <w:proofErr w:type="spellStart"/>
-      <w:r>
-        <w:t>Steinacher</w:t>
-      </w:r>
-      <w:proofErr w:type="spellEnd"/>
-      <w:r>
-        <w:t xml:space="preserve">, M., </w:t>
-      </w:r>
-      <w:proofErr w:type="spellStart"/>
-      <w:r>
-        <w:t>Joos</w:t>
-      </w:r>
-      <w:proofErr w:type="spellEnd"/>
-      <w:r>
-        <w:t xml:space="preserve">, F., </w:t>
-      </w:r>
-      <w:proofErr w:type="spellStart"/>
-      <w:r>
-        <w:t>Frolicher</w:t>
-      </w:r>
-      <w:proofErr w:type="spellEnd"/>
-      <w:r>
-        <w:t xml:space="preserve">, T.L., Bopp, L., </w:t>
-      </w:r>
-      <w:proofErr w:type="spellStart"/>
-      <w:r>
-        <w:t>Cadule</w:t>
-      </w:r>
-      <w:proofErr w:type="spellEnd"/>
-      <w:r>
-        <w:t xml:space="preserve">, P., </w:t>
-      </w:r>
-      <w:proofErr w:type="spellStart"/>
-      <w:r>
-        <w:t>Cocco</w:t>
-      </w:r>
-      <w:proofErr w:type="spellEnd"/>
-      <w:r>
-        <w:t xml:space="preserve">, V., </w:t>
+      <w:r>
+        <w:t xml:space="preserve">Steinacher, M., Joos, F., Frolicher, T.L., Bopp, L., Cadule, P., Cocco, V., </w:t>
       </w:r>
       <w:r>
         <w:rPr>
@@ -31165,7 +29700,6 @@
       <w:r>
         <w:t xml:space="preserve"> (2010). Projected 21st century decrease in marine productivity: a multi-model analysis. </w:t>
       </w:r>
-      <w:proofErr w:type="spellStart"/>
       <w:r>
         <w:rPr>
           <w:i/>
@@ -31173,7 +29707,6 @@
         </w:rPr>
         <w:t>Biogeosciences</w:t>
       </w:r>
-      <w:proofErr w:type="spellEnd"/>
       <w:r>
         <w:t>, 7.</w:t>
       </w:r>
@@ -31182,21 +29715,8 @@
       <w:pPr>
         <w:pStyle w:val="Bibliography"/>
       </w:pPr>
-      <w:proofErr w:type="spellStart"/>
-      <w:r>
-        <w:t>Svedäng</w:t>
-      </w:r>
-      <w:proofErr w:type="spellEnd"/>
-      <w:r>
-        <w:t xml:space="preserve">, H. &amp; </w:t>
-      </w:r>
-      <w:proofErr w:type="spellStart"/>
-      <w:r>
-        <w:t>Hornborg</w:t>
-      </w:r>
-      <w:proofErr w:type="spellEnd"/>
-      <w:r>
-        <w:t xml:space="preserve">, S. (2014). Selective fishing induces density-dependent growth. </w:t>
+      <w:r>
+        <w:t xml:space="preserve">Svedäng, H. &amp; Hornborg, S. (2014). Selective fishing induces density-dependent growth. </w:t>
       </w:r>
       <w:r>
         <w:rPr>
@@ -31213,13 +29733,8 @@
       <w:pPr>
         <w:pStyle w:val="Bibliography"/>
       </w:pPr>
-      <w:proofErr w:type="spellStart"/>
-      <w:r>
-        <w:t>Szuwalski</w:t>
-      </w:r>
-      <w:proofErr w:type="spellEnd"/>
-      <w:r>
-        <w:t xml:space="preserve">, C.S., Burgess, M.G., Costello, C. &amp; Gaines, S.D. (2017). High fishery catches through trophic cascades in China. </w:t>
+      <w:r>
+        <w:t xml:space="preserve">Szuwalski, C.S., Burgess, M.G., Costello, C. &amp; Gaines, S.D. (2017). High fishery catches through trophic cascades in China. </w:t>
       </w:r>
       <w:r>
         <w:rPr>
@@ -31237,15 +29752,7 @@
         <w:pStyle w:val="Bibliography"/>
       </w:pPr>
       <w:r>
-        <w:t xml:space="preserve">Thorson, J.T., </w:t>
-      </w:r>
-      <w:proofErr w:type="spellStart"/>
-      <w:r>
-        <w:t>Monnahan</w:t>
-      </w:r>
-      <w:proofErr w:type="spellEnd"/>
-      <w:r>
-        <w:t xml:space="preserve">, C.C. &amp; Cope, J.M. (2015). The potential impact of time-variation in vital rates on fisheries management targets for marine fishes. </w:t>
+        <w:t xml:space="preserve">Thorson, J.T., Monnahan, C.C. &amp; Cope, J.M. (2015). The potential impact of time-variation in vital rates on fisheries management targets for marine fishes. </w:t>
       </w:r>
       <w:r>
         <w:rPr>
@@ -31281,15 +29788,7 @@
         <w:pStyle w:val="Bibliography"/>
       </w:pPr>
       <w:r>
-        <w:t xml:space="preserve">Thresher, R.E., </w:t>
-      </w:r>
-      <w:proofErr w:type="spellStart"/>
-      <w:r>
-        <w:t>Koslow</w:t>
-      </w:r>
-      <w:proofErr w:type="spellEnd"/>
-      <w:r>
-        <w:t xml:space="preserve">, J.A., Morison, A.K. &amp; Smith, D.C. (2007). Depth-mediated reversal of the effects of climate change on long-term growth rates of exploited marine fish. </w:t>
+        <w:t xml:space="preserve">Thresher, R.E., Koslow, J.A., Morison, A.K. &amp; Smith, D.C. (2007). Depth-mediated reversal of the effects of climate change on long-term growth rates of exploited marine fish. </w:t>
       </w:r>
       <w:r>
         <w:rPr>
@@ -31306,21 +29805,8 @@
       <w:pPr>
         <w:pStyle w:val="Bibliography"/>
       </w:pPr>
-      <w:proofErr w:type="spellStart"/>
-      <w:r>
-        <w:t>Tittensor</w:t>
-      </w:r>
-      <w:proofErr w:type="spellEnd"/>
-      <w:r>
-        <w:t xml:space="preserve">, D.P., </w:t>
-      </w:r>
-      <w:proofErr w:type="spellStart"/>
-      <w:r>
-        <w:t>Novaglio</w:t>
-      </w:r>
-      <w:proofErr w:type="spellEnd"/>
-      <w:r>
-        <w:t xml:space="preserve">, C., Harrison, C.S., Heneghan, R.F., Barrier, N., Bianchi, D., </w:t>
+      <w:r>
+        <w:t xml:space="preserve">Tittensor, D.P., Novaglio, C., Harrison, C.S., Heneghan, R.F., Barrier, N., Bianchi, D., </w:t>
       </w:r>
       <w:r>
         <w:rPr>
@@ -31337,23 +29823,7 @@
           <w:i/>
           <w:iCs/>
         </w:rPr>
-        <w:t xml:space="preserve">Nat. </w:t>
-      </w:r>
-      <w:proofErr w:type="spellStart"/>
-      <w:r>
-        <w:rPr>
-          <w:i/>
-          <w:iCs/>
-        </w:rPr>
-        <w:t>Clim</w:t>
-      </w:r>
-      <w:proofErr w:type="spellEnd"/>
-      <w:r>
-        <w:rPr>
-          <w:i/>
-          <w:iCs/>
-        </w:rPr>
-        <w:t>. Chang.</w:t>
+        <w:t>Nat. Clim. Chang.</w:t>
       </w:r>
       <w:r>
         <w:t>, 11, 973–981.</w:t>
@@ -31411,74 +29881,8 @@
           <w:iCs/>
           <w:lang w:val="sv-SE"/>
         </w:rPr>
-        <w:t xml:space="preserve">Meddelelser </w:t>
-      </w:r>
-      <w:proofErr w:type="spellStart"/>
-      <w:r>
-        <w:rPr>
-          <w:i/>
-          <w:iCs/>
-          <w:lang w:val="sv-SE"/>
-        </w:rPr>
-        <w:t>fra</w:t>
-      </w:r>
-      <w:proofErr w:type="spellEnd"/>
-      <w:r>
-        <w:rPr>
-          <w:i/>
-          <w:iCs/>
-          <w:lang w:val="sv-SE"/>
-        </w:rPr>
-        <w:t xml:space="preserve"> Danmarks Fiskeri-</w:t>
-      </w:r>
-      <w:proofErr w:type="spellStart"/>
-      <w:r>
-        <w:rPr>
-          <w:i/>
-          <w:iCs/>
-          <w:lang w:val="sv-SE"/>
-        </w:rPr>
-        <w:t>og</w:t>
-      </w:r>
-      <w:proofErr w:type="spellEnd"/>
-      <w:r>
-        <w:rPr>
-          <w:i/>
-          <w:iCs/>
-          <w:lang w:val="sv-SE"/>
-        </w:rPr>
-        <w:t xml:space="preserve"> </w:t>
-      </w:r>
-      <w:proofErr w:type="spellStart"/>
-      <w:proofErr w:type="gramStart"/>
-      <w:r>
-        <w:rPr>
-          <w:i/>
-          <w:iCs/>
-          <w:lang w:val="sv-SE"/>
-        </w:rPr>
-        <w:t>Havun</w:t>
-      </w:r>
-      <w:proofErr w:type="spellEnd"/>
-      <w:r>
-        <w:rPr>
-          <w:i/>
-          <w:iCs/>
-          <w:lang w:val="sv-SE"/>
-        </w:rPr>
-        <w:t xml:space="preserve">- </w:t>
-      </w:r>
-      <w:proofErr w:type="spellStart"/>
-      <w:r>
-        <w:rPr>
-          <w:i/>
-          <w:iCs/>
-          <w:lang w:val="sv-SE"/>
-        </w:rPr>
-        <w:t>dersgelser</w:t>
-      </w:r>
-      <w:proofErr w:type="spellEnd"/>
-      <w:proofErr w:type="gramEnd"/>
+        <w:t>Meddelelser fra Danmarks Fiskeri-og Havun- dersgelser</w:t>
+      </w:r>
       <w:r>
         <w:rPr>
           <w:lang w:val="sv-SE"/>
@@ -31491,15 +29895,7 @@
         <w:pStyle w:val="Bibliography"/>
       </w:pPr>
       <w:r>
-        <w:t>Woodworth-</w:t>
-      </w:r>
-      <w:proofErr w:type="spellStart"/>
-      <w:r>
-        <w:t>Jefcoats</w:t>
-      </w:r>
-      <w:proofErr w:type="spellEnd"/>
-      <w:r>
-        <w:t xml:space="preserve">, P.A., Blanchard, J.L. &amp; Drazen, J.C. (2019). Relative Impacts of Simultaneous Stressors on a Pelagic Marine Ecosystem. </w:t>
+        <w:t xml:space="preserve">Woodworth-Jefcoats, P.A., Blanchard, J.L. &amp; Drazen, J.C. (2019). Relative Impacts of Simultaneous Stressors on a Pelagic Marine Ecosystem. </w:t>
       </w:r>
       <w:r>
         <w:rPr>
@@ -31517,23 +29913,7 @@
         <w:pStyle w:val="Bibliography"/>
       </w:pPr>
       <w:r>
-        <w:t>Woodworth-</w:t>
-      </w:r>
-      <w:proofErr w:type="spellStart"/>
-      <w:r>
-        <w:t>Jefcoats</w:t>
-      </w:r>
-      <w:proofErr w:type="spellEnd"/>
-      <w:r>
-        <w:t xml:space="preserve">, P.A., </w:t>
-      </w:r>
-      <w:proofErr w:type="spellStart"/>
-      <w:r>
-        <w:t>Polovina</w:t>
-      </w:r>
-      <w:proofErr w:type="spellEnd"/>
-      <w:r>
-        <w:t xml:space="preserve">, J.J., Dunne, J.P. &amp; Blanchard, J.L. (2013). Ecosystem size structure response to 21st century climate projection: large fish abundance decreases in the central North Pacific and increases in the California Current. </w:t>
+        <w:t xml:space="preserve">Woodworth-Jefcoats, P.A., Polovina, J.J., Dunne, J.P. &amp; Blanchard, J.L. (2013). Ecosystem size structure response to 21st century climate projection: large fish abundance decreases in the central North Pacific and increases in the California Current. </w:t>
       </w:r>
       <w:r>
         <w:rPr>
@@ -31551,23 +29931,7 @@
         <w:pStyle w:val="Bibliography"/>
       </w:pPr>
       <w:r>
-        <w:t>Woodworth-</w:t>
-      </w:r>
-      <w:proofErr w:type="spellStart"/>
-      <w:r>
-        <w:t>Jefcoats</w:t>
-      </w:r>
-      <w:proofErr w:type="spellEnd"/>
-      <w:r>
-        <w:t xml:space="preserve">, P.A., </w:t>
-      </w:r>
-      <w:proofErr w:type="spellStart"/>
-      <w:r>
-        <w:t>Polovina</w:t>
-      </w:r>
-      <w:proofErr w:type="spellEnd"/>
-      <w:r>
-        <w:t xml:space="preserve">, J.J., Howell, E.A. &amp; Blanchard, J.L. (2015). Two takes on the ecosystem impacts of climate change and fishing: Comparing a size-based and </w:t>
+        <w:t xml:space="preserve">Woodworth-Jefcoats, P.A., Polovina, J.J., Howell, E.A. &amp; Blanchard, J.L. (2015). Two takes on the ecosystem impacts of climate change and fishing: Comparing a size-based and </w:t>
       </w:r>
       <w:r>
         <w:lastRenderedPageBreak/>
@@ -33697,11 +32061,6 @@
         <w:docPartUnique/>
       </w:docPartObj>
     </w:sdtPr>
-    <w:sdtEndPr>
-      <w:rPr>
-        <w:rStyle w:val="PageNumber"/>
-      </w:rPr>
-    </w:sdtEndPr>
     <w:sdtContent>
       <w:p>
         <w:pPr>
@@ -33753,11 +32112,6 @@
         <w:docPartUnique/>
       </w:docPartObj>
     </w:sdtPr>
-    <w:sdtEndPr>
-      <w:rPr>
-        <w:rStyle w:val="PageNumber"/>
-      </w:rPr>
-    </w:sdtEndPr>
     <w:sdtContent>
       <w:p>
         <w:pPr>

</xml_diff>